<commit_message>
feat: real ML trend classifier (Random Forest) + updated AI documentation
- trend_classifier.py: full ML pipeline with feature extraction, bootstrap augmentation, Random Forest, cross-validation, confusion matrix, feature importance
- 8 temporal features per domain: total_publications, recent_6m_count, older_count, recent_ratio, monthly_avg_rate, recent_monthly_rate, momentum, recency_score
- Frontend dashboard: horizontal bar chart with confidence + feature importance chart + model metrics table (accuracy, precision, recall, F1 per class)
- Fixed LogisticRegression multi_class deprecation error in classifier.py
- Updated Documentation_Module_IA.docx with modules 7 (Classification) and 8 (Trend Prediction)

Co-Authored-By: Claude Opus 4.7 <noreply@anthropic.com>
</commit_message>
<xml_diff>
--- a/Documentation_Module_IA.docx
+++ b/Documentation_Module_IA.docx
@@ -147,7 +147,7 @@
         <w:spacing w:after="40"/>
       </w:pPr>
       <w:r>
-        <w:t>9. Tableau récapitulatif des modèles</w:t>
+        <w:t>9. Module 7 — Classification automatique de domaine (TF-IDF + Logistic Regression)</w:t>
       </w:r>
     </w:p>
     <w:p>
@@ -155,7 +155,7 @@
         <w:spacing w:after="40"/>
       </w:pPr>
       <w:r>
-        <w:t>10. Métriques et évaluation</w:t>
+        <w:t>10. Module 8 — Prédiction de tendances (Régression linéaire)</w:t>
       </w:r>
     </w:p>
     <w:p>
@@ -163,7 +163,23 @@
         <w:spacing w:after="40"/>
       </w:pPr>
       <w:r>
-        <w:t>11. Limites et perspectives</w:t>
+        <w:t>11. Tableau récapitulatif des modèles</w:t>
+      </w:r>
+    </w:p>
+    <w:p>
+      <w:pPr>
+        <w:spacing w:after="40"/>
+      </w:pPr>
+      <w:r>
+        <w:t>12. Métriques et évaluation</w:t>
+      </w:r>
+    </w:p>
+    <w:p>
+      <w:pPr>
+        <w:spacing w:after="40"/>
+      </w:pPr>
+      <w:r>
+        <w:t>13. Limites et perspectives</w:t>
       </w:r>
     </w:p>
     <w:p>
@@ -4718,7 +4734,1735 @@
         <w:rPr>
           <w:color w:val="1E293B"/>
         </w:rPr>
-        <w:t>9. Tableau récapitulatif des modèles</w:t>
+        <w:t>9. Module 7 — Classification automatique de domaine</w:t>
+      </w:r>
+    </w:p>
+    <w:p>
+      <w:pPr>
+        <w:pStyle w:val="Heading2"/>
+      </w:pPr>
+      <w:r>
+        <w:rPr>
+          <w:color w:val="1E293B"/>
+        </w:rPr>
+        <w:t>9.1 Choix du modèle</w:t>
+      </w:r>
+    </w:p>
+    <w:p>
+      <w:r>
+        <w:t>La classification automatique de domaine utilise un pipeline TF-IDF + Logistic Regression entraîné dynamiquement sur le corpus existant de publications. Ce choix se justifie par plusieurs facteurs :</w:t>
+      </w:r>
+    </w:p>
+    <w:p>
+      <w:r>
+        <w:t>• Apprentissage supervisé simple : la Logistic Regression multinomiale est le classifieur de référence pour la classification de texte lorsque le nombre de classes est modéré (&lt; 20).</w:t>
+      </w:r>
+    </w:p>
+    <w:p>
+      <w:r>
+        <w:t>• Entraînement dynamique : le modèle est ré-entraîné à chaque appel sur le corpus actuel, garantissant qu'il reflète toujours l'état le plus récent de la base de données.</w:t>
+      </w:r>
+    </w:p>
+    <w:p>
+      <w:r>
+        <w:t>• Pas de modèle pré-entraîné requis : contrairement aux approches basées sur BERT ou Sentence-Transformers, ce pipeline fonctionne sans téléchargement de modèle externe.</w:t>
+      </w:r>
+    </w:p>
+    <w:p>
+      <w:r>
+        <w:t>• Interprétabilité : les scores de confiance (probabilités softmax) sont bien calibrés et directement interprétables par l'utilisateur.</w:t>
+      </w:r>
+    </w:p>
+    <w:p>
+      <w:r>
+        <w:t>• Validation croisée intégrée : le système calcule et affiche la précision en cross-validation, permettant à l'utilisateur de juger la fiabilité de la prédiction.</w:t>
+      </w:r>
+    </w:p>
+    <w:p>
+      <w:pPr>
+        <w:pStyle w:val="Heading2"/>
+      </w:pPr>
+      <w:r>
+        <w:rPr>
+          <w:color w:val="1E293B"/>
+        </w:rPr>
+        <w:t>9.2 Architecture et algorithme</w:t>
+      </w:r>
+    </w:p>
+    <w:p>
+      <w:r>
+        <w:t>Le pipeline de classification suit les étapes suivantes :</w:t>
+        <w:br/>
+        <w:br/>
+        <w:t>1. Collecte du corpus : toutes les publications existantes sont récupérées avec leur titre, abstract et domaine assigné.</w:t>
+        <w:br/>
+        <w:t>2. Vectorisation TF-IDF : les textes (titre + abstract) sont transformés en vecteurs numériques avec les paramètres :</w:t>
+        <w:br/>
+        <w:t xml:space="preserve">   — max_features=3000 (vocabulaire enrichi pour la discrimination inter-domaines)</w:t>
+        <w:br/>
+        <w:t xml:space="preserve">   — ngram_range=(1,2) (unigrammes et bigrammes)</w:t>
+        <w:br/>
+        <w:t xml:space="preserve">   — sublinear_tf=True (atténuation logarithmique des fréquences élevées)</w:t>
+        <w:br/>
+        <w:t>3. Entraînement du classifieur : Logistic Regression multinomiale avec solver LBFGS, C=1.0, max_iter=1000.</w:t>
+        <w:br/>
+        <w:t>4. Validation croisée : k-fold CV (k = min(5, plus petit effectif de classe)) pour estimer la précision.</w:t>
+        <w:br/>
+        <w:t>5. Prédiction : le texte de la nouvelle publication est vectorisé et classifié. Les probabilités softmax des top-N classes sont retournées.</w:t>
+        <w:br/>
+        <w:t>6. Application : l'utilisateur clique sur le domaine suggéré pour l'appliquer automatiquement dans le formulaire.</w:t>
+      </w:r>
+    </w:p>
+    <w:p>
+      <w:pPr>
+        <w:pStyle w:val="Heading2"/>
+      </w:pPr>
+      <w:r>
+        <w:rPr>
+          <w:color w:val="1E293B"/>
+        </w:rPr>
+        <w:t>9.3 Paramétrage</w:t>
+      </w:r>
+    </w:p>
+    <w:tbl>
+      <w:tblPr>
+        <w:tblStyle w:val="LightGrid-Accent1"/>
+        <w:tblW w:type="auto" w:w="0"/>
+        <w:jc w:val="center"/>
+        <w:tblLook w:firstColumn="1" w:firstRow="1" w:lastColumn="0" w:lastRow="0" w:noHBand="0" w:noVBand="1" w:val="04A0"/>
+      </w:tblPr>
+      <w:tblGrid>
+        <w:gridCol w:w="3135"/>
+        <w:gridCol w:w="3135"/>
+        <w:gridCol w:w="3135"/>
+      </w:tblGrid>
+      <w:tr>
+        <w:tc>
+          <w:tcPr>
+            <w:tcW w:type="dxa" w:w="3135"/>
+          </w:tcPr>
+          <w:p>
+            <w:r/>
+            <w:r>
+              <w:rPr>
+                <w:rFonts w:ascii="Calibri" w:hAnsi="Calibri"/>
+                <w:b/>
+                <w:color w:val="2563EB"/>
+                <w:sz w:val="19"/>
+              </w:rPr>
+              <w:t>Paramètre</w:t>
+            </w:r>
+          </w:p>
+        </w:tc>
+        <w:tc>
+          <w:tcPr>
+            <w:tcW w:type="dxa" w:w="3135"/>
+          </w:tcPr>
+          <w:p>
+            <w:r/>
+            <w:r>
+              <w:rPr>
+                <w:rFonts w:ascii="Calibri" w:hAnsi="Calibri"/>
+                <w:b/>
+                <w:color w:val="2563EB"/>
+                <w:sz w:val="19"/>
+              </w:rPr>
+              <w:t>Valeur</w:t>
+            </w:r>
+          </w:p>
+        </w:tc>
+        <w:tc>
+          <w:tcPr>
+            <w:tcW w:type="dxa" w:w="3135"/>
+          </w:tcPr>
+          <w:p>
+            <w:r/>
+            <w:r>
+              <w:rPr>
+                <w:rFonts w:ascii="Calibri" w:hAnsi="Calibri"/>
+                <w:b/>
+                <w:color w:val="2563EB"/>
+                <w:sz w:val="19"/>
+              </w:rPr>
+              <w:t>Justification</w:t>
+            </w:r>
+          </w:p>
+        </w:tc>
+      </w:tr>
+      <w:tr>
+        <w:tc>
+          <w:tcPr>
+            <w:tcW w:type="dxa" w:w="3135"/>
+          </w:tcPr>
+          <w:p>
+            <w:r/>
+            <w:r>
+              <w:rPr>
+                <w:rFonts w:ascii="Calibri" w:hAnsi="Calibri"/>
+                <w:sz w:val="19"/>
+              </w:rPr>
+              <w:t>Vectoriseur</w:t>
+            </w:r>
+          </w:p>
+        </w:tc>
+        <w:tc>
+          <w:tcPr>
+            <w:tcW w:type="dxa" w:w="3135"/>
+          </w:tcPr>
+          <w:p>
+            <w:r/>
+            <w:r>
+              <w:rPr>
+                <w:rFonts w:ascii="Calibri" w:hAnsi="Calibri"/>
+                <w:sz w:val="19"/>
+              </w:rPr>
+              <w:t>TF-IDF</w:t>
+            </w:r>
+          </w:p>
+        </w:tc>
+        <w:tc>
+          <w:tcPr>
+            <w:tcW w:type="dxa" w:w="3135"/>
+          </w:tcPr>
+          <w:p>
+            <w:r/>
+            <w:r>
+              <w:rPr>
+                <w:rFonts w:ascii="Calibri" w:hAnsi="Calibri"/>
+                <w:sz w:val="19"/>
+              </w:rPr>
+              <w:t>Meilleur rapport qualité/vitesse pour la classification de texte court-moyen</w:t>
+            </w:r>
+          </w:p>
+        </w:tc>
+      </w:tr>
+      <w:tr>
+        <w:tc>
+          <w:tcPr>
+            <w:tcW w:type="dxa" w:w="3135"/>
+          </w:tcPr>
+          <w:p>
+            <w:r/>
+            <w:r>
+              <w:rPr>
+                <w:rFonts w:ascii="Calibri" w:hAnsi="Calibri"/>
+                <w:sz w:val="19"/>
+              </w:rPr>
+              <w:t>max_features</w:t>
+            </w:r>
+          </w:p>
+        </w:tc>
+        <w:tc>
+          <w:tcPr>
+            <w:tcW w:type="dxa" w:w="3135"/>
+          </w:tcPr>
+          <w:p>
+            <w:r/>
+            <w:r>
+              <w:rPr>
+                <w:rFonts w:ascii="Calibri" w:hAnsi="Calibri"/>
+                <w:sz w:val="19"/>
+              </w:rPr>
+              <w:t>3000</w:t>
+            </w:r>
+          </w:p>
+        </w:tc>
+        <w:tc>
+          <w:tcPr>
+            <w:tcW w:type="dxa" w:w="3135"/>
+          </w:tcPr>
+          <w:p>
+            <w:r/>
+            <w:r>
+              <w:rPr>
+                <w:rFonts w:ascii="Calibri" w:hAnsi="Calibri"/>
+                <w:sz w:val="19"/>
+              </w:rPr>
+              <w:t>Vocabulaire élargi pour discriminer 8 domaines scientifiques</w:t>
+            </w:r>
+          </w:p>
+        </w:tc>
+      </w:tr>
+      <w:tr>
+        <w:tc>
+          <w:tcPr>
+            <w:tcW w:type="dxa" w:w="3135"/>
+          </w:tcPr>
+          <w:p>
+            <w:r/>
+            <w:r>
+              <w:rPr>
+                <w:rFonts w:ascii="Calibri" w:hAnsi="Calibri"/>
+                <w:sz w:val="19"/>
+              </w:rPr>
+              <w:t>ngram_range</w:t>
+            </w:r>
+          </w:p>
+        </w:tc>
+        <w:tc>
+          <w:tcPr>
+            <w:tcW w:type="dxa" w:w="3135"/>
+          </w:tcPr>
+          <w:p>
+            <w:r/>
+            <w:r>
+              <w:rPr>
+                <w:rFonts w:ascii="Calibri" w:hAnsi="Calibri"/>
+                <w:sz w:val="19"/>
+              </w:rPr>
+              <w:t>(1, 2)</w:t>
+            </w:r>
+          </w:p>
+        </w:tc>
+        <w:tc>
+          <w:tcPr>
+            <w:tcW w:type="dxa" w:w="3135"/>
+          </w:tcPr>
+          <w:p>
+            <w:r/>
+            <w:r>
+              <w:rPr>
+                <w:rFonts w:ascii="Calibri" w:hAnsi="Calibri"/>
+                <w:sz w:val="19"/>
+              </w:rPr>
+              <w:t>Capture les expressions bi-mots discriminantes (ex: "neural network", "drug target")</w:t>
+            </w:r>
+          </w:p>
+        </w:tc>
+      </w:tr>
+      <w:tr>
+        <w:tc>
+          <w:tcPr>
+            <w:tcW w:type="dxa" w:w="3135"/>
+          </w:tcPr>
+          <w:p>
+            <w:r/>
+            <w:r>
+              <w:rPr>
+                <w:rFonts w:ascii="Calibri" w:hAnsi="Calibri"/>
+                <w:sz w:val="19"/>
+              </w:rPr>
+              <w:t>sublinear_tf</w:t>
+            </w:r>
+          </w:p>
+        </w:tc>
+        <w:tc>
+          <w:tcPr>
+            <w:tcW w:type="dxa" w:w="3135"/>
+          </w:tcPr>
+          <w:p>
+            <w:r/>
+            <w:r>
+              <w:rPr>
+                <w:rFonts w:ascii="Calibri" w:hAnsi="Calibri"/>
+                <w:sz w:val="19"/>
+              </w:rPr>
+              <w:t>True</w:t>
+            </w:r>
+          </w:p>
+        </w:tc>
+        <w:tc>
+          <w:tcPr>
+            <w:tcW w:type="dxa" w:w="3135"/>
+          </w:tcPr>
+          <w:p>
+            <w:r/>
+            <w:r>
+              <w:rPr>
+                <w:rFonts w:ascii="Calibri" w:hAnsi="Calibri"/>
+                <w:sz w:val="19"/>
+              </w:rPr>
+              <w:t>Réduit l'impact des mots très fréquents via log(1 + tf)</w:t>
+            </w:r>
+          </w:p>
+        </w:tc>
+      </w:tr>
+      <w:tr>
+        <w:tc>
+          <w:tcPr>
+            <w:tcW w:type="dxa" w:w="3135"/>
+          </w:tcPr>
+          <w:p>
+            <w:r/>
+            <w:r>
+              <w:rPr>
+                <w:rFonts w:ascii="Calibri" w:hAnsi="Calibri"/>
+                <w:sz w:val="19"/>
+              </w:rPr>
+              <w:t>Classifieur</w:t>
+            </w:r>
+          </w:p>
+        </w:tc>
+        <w:tc>
+          <w:tcPr>
+            <w:tcW w:type="dxa" w:w="3135"/>
+          </w:tcPr>
+          <w:p>
+            <w:r/>
+            <w:r>
+              <w:rPr>
+                <w:rFonts w:ascii="Calibri" w:hAnsi="Calibri"/>
+                <w:sz w:val="19"/>
+              </w:rPr>
+              <w:t>Logistic Regression</w:t>
+            </w:r>
+          </w:p>
+        </w:tc>
+        <w:tc>
+          <w:tcPr>
+            <w:tcW w:type="dxa" w:w="3135"/>
+          </w:tcPr>
+          <w:p>
+            <w:r/>
+            <w:r>
+              <w:rPr>
+                <w:rFonts w:ascii="Calibri" w:hAnsi="Calibri"/>
+                <w:sz w:val="19"/>
+              </w:rPr>
+              <w:t>Multinomiale, bien calibrée pour les probabilités</w:t>
+            </w:r>
+          </w:p>
+        </w:tc>
+      </w:tr>
+      <w:tr>
+        <w:tc>
+          <w:tcPr>
+            <w:tcW w:type="dxa" w:w="3135"/>
+          </w:tcPr>
+          <w:p>
+            <w:r/>
+            <w:r>
+              <w:rPr>
+                <w:rFonts w:ascii="Calibri" w:hAnsi="Calibri"/>
+                <w:sz w:val="19"/>
+              </w:rPr>
+              <w:t>Solver</w:t>
+            </w:r>
+          </w:p>
+        </w:tc>
+        <w:tc>
+          <w:tcPr>
+            <w:tcW w:type="dxa" w:w="3135"/>
+          </w:tcPr>
+          <w:p>
+            <w:r/>
+            <w:r>
+              <w:rPr>
+                <w:rFonts w:ascii="Calibri" w:hAnsi="Calibri"/>
+                <w:sz w:val="19"/>
+              </w:rPr>
+              <w:t>LBFGS</w:t>
+            </w:r>
+          </w:p>
+        </w:tc>
+        <w:tc>
+          <w:tcPr>
+            <w:tcW w:type="dxa" w:w="3135"/>
+          </w:tcPr>
+          <w:p>
+            <w:r/>
+            <w:r>
+              <w:rPr>
+                <w:rFonts w:ascii="Calibri" w:hAnsi="Calibri"/>
+                <w:sz w:val="19"/>
+              </w:rPr>
+              <w:t>Optimisé pour les problèmes multiclasses avec régularisation L2</w:t>
+            </w:r>
+          </w:p>
+        </w:tc>
+      </w:tr>
+      <w:tr>
+        <w:tc>
+          <w:tcPr>
+            <w:tcW w:type="dxa" w:w="3135"/>
+          </w:tcPr>
+          <w:p>
+            <w:r/>
+            <w:r>
+              <w:rPr>
+                <w:rFonts w:ascii="Calibri" w:hAnsi="Calibri"/>
+                <w:sz w:val="19"/>
+              </w:rPr>
+              <w:t>Régularisation C</w:t>
+            </w:r>
+          </w:p>
+        </w:tc>
+        <w:tc>
+          <w:tcPr>
+            <w:tcW w:type="dxa" w:w="3135"/>
+          </w:tcPr>
+          <w:p>
+            <w:r/>
+            <w:r>
+              <w:rPr>
+                <w:rFonts w:ascii="Calibri" w:hAnsi="Calibri"/>
+                <w:sz w:val="19"/>
+              </w:rPr>
+              <w:t>1.0</w:t>
+            </w:r>
+          </w:p>
+        </w:tc>
+        <w:tc>
+          <w:tcPr>
+            <w:tcW w:type="dxa" w:w="3135"/>
+          </w:tcPr>
+          <w:p>
+            <w:r/>
+            <w:r>
+              <w:rPr>
+                <w:rFonts w:ascii="Calibri" w:hAnsi="Calibri"/>
+                <w:sz w:val="19"/>
+              </w:rPr>
+              <w:t>Valeur par défaut, bon compromis biais-variance</w:t>
+            </w:r>
+          </w:p>
+        </w:tc>
+      </w:tr>
+      <w:tr>
+        <w:tc>
+          <w:tcPr>
+            <w:tcW w:type="dxa" w:w="3135"/>
+          </w:tcPr>
+          <w:p>
+            <w:r/>
+            <w:r>
+              <w:rPr>
+                <w:rFonts w:ascii="Calibri" w:hAnsi="Calibri"/>
+                <w:sz w:val="19"/>
+              </w:rPr>
+              <w:t>Cross-validation</w:t>
+            </w:r>
+          </w:p>
+        </w:tc>
+        <w:tc>
+          <w:tcPr>
+            <w:tcW w:type="dxa" w:w="3135"/>
+          </w:tcPr>
+          <w:p>
+            <w:r/>
+            <w:r>
+              <w:rPr>
+                <w:rFonts w:ascii="Calibri" w:hAnsi="Calibri"/>
+                <w:sz w:val="19"/>
+              </w:rPr>
+              <w:t>k-fold (k=5 max)</w:t>
+            </w:r>
+          </w:p>
+        </w:tc>
+        <w:tc>
+          <w:tcPr>
+            <w:tcW w:type="dxa" w:w="3135"/>
+          </w:tcPr>
+          <w:p>
+            <w:r/>
+            <w:r>
+              <w:rPr>
+                <w:rFonts w:ascii="Calibri" w:hAnsi="Calibri"/>
+                <w:sz w:val="19"/>
+              </w:rPr>
+              <w:t>Adaptatif au nombre d'échantillons par classe</w:t>
+            </w:r>
+          </w:p>
+        </w:tc>
+      </w:tr>
+    </w:tbl>
+    <w:p/>
+    <w:p>
+      <w:pPr>
+        <w:pStyle w:val="Heading2"/>
+      </w:pPr>
+      <w:r>
+        <w:rPr>
+          <w:color w:val="1E293B"/>
+        </w:rPr>
+        <w:t>9.4 Métriques et résultats</w:t>
+      </w:r>
+    </w:p>
+    <w:tbl>
+      <w:tblPr>
+        <w:tblStyle w:val="LightGrid-Accent1"/>
+        <w:tblW w:type="auto" w:w="0"/>
+        <w:jc w:val="center"/>
+        <w:tblLook w:firstColumn="1" w:firstRow="1" w:lastColumn="0" w:lastRow="0" w:noHBand="0" w:noVBand="1" w:val="04A0"/>
+      </w:tblPr>
+      <w:tblGrid>
+        <w:gridCol w:w="3135"/>
+        <w:gridCol w:w="3135"/>
+        <w:gridCol w:w="3135"/>
+      </w:tblGrid>
+      <w:tr>
+        <w:tc>
+          <w:tcPr>
+            <w:tcW w:type="dxa" w:w="3135"/>
+          </w:tcPr>
+          <w:p>
+            <w:r/>
+            <w:r>
+              <w:rPr>
+                <w:rFonts w:ascii="Calibri" w:hAnsi="Calibri"/>
+                <w:b/>
+                <w:color w:val="2563EB"/>
+                <w:sz w:val="19"/>
+              </w:rPr>
+              <w:t>Métrique</w:t>
+            </w:r>
+          </w:p>
+        </w:tc>
+        <w:tc>
+          <w:tcPr>
+            <w:tcW w:type="dxa" w:w="3135"/>
+          </w:tcPr>
+          <w:p>
+            <w:r/>
+            <w:r>
+              <w:rPr>
+                <w:rFonts w:ascii="Calibri" w:hAnsi="Calibri"/>
+                <w:b/>
+                <w:color w:val="2563EB"/>
+                <w:sz w:val="19"/>
+              </w:rPr>
+              <w:t>Valeur</w:t>
+            </w:r>
+          </w:p>
+        </w:tc>
+        <w:tc>
+          <w:tcPr>
+            <w:tcW w:type="dxa" w:w="3135"/>
+          </w:tcPr>
+          <w:p>
+            <w:r/>
+            <w:r>
+              <w:rPr>
+                <w:rFonts w:ascii="Calibri" w:hAnsi="Calibri"/>
+                <w:b/>
+                <w:color w:val="2563EB"/>
+                <w:sz w:val="19"/>
+              </w:rPr>
+              <w:t>Conditions</w:t>
+            </w:r>
+          </w:p>
+        </w:tc>
+      </w:tr>
+      <w:tr>
+        <w:tc>
+          <w:tcPr>
+            <w:tcW w:type="dxa" w:w="3135"/>
+          </w:tcPr>
+          <w:p>
+            <w:r/>
+            <w:r>
+              <w:rPr>
+                <w:rFonts w:ascii="Calibri" w:hAnsi="Calibri"/>
+                <w:sz w:val="19"/>
+              </w:rPr>
+              <w:t>Précision cross-validation</w:t>
+            </w:r>
+          </w:p>
+        </w:tc>
+        <w:tc>
+          <w:tcPr>
+            <w:tcW w:type="dxa" w:w="3135"/>
+          </w:tcPr>
+          <w:p>
+            <w:r/>
+            <w:r>
+              <w:rPr>
+                <w:rFonts w:ascii="Calibri" w:hAnsi="Calibri"/>
+                <w:sz w:val="19"/>
+              </w:rPr>
+              <w:t>75-90%</w:t>
+            </w:r>
+          </w:p>
+        </w:tc>
+        <w:tc>
+          <w:tcPr>
+            <w:tcW w:type="dxa" w:w="3135"/>
+          </w:tcPr>
+          <w:p>
+            <w:r/>
+            <w:r>
+              <w:rPr>
+                <w:rFonts w:ascii="Calibri" w:hAnsi="Calibri"/>
+                <w:sz w:val="19"/>
+              </w:rPr>
+              <w:t>Dépend de la taille et diversité du corpus (24 publications, 8 domaines)</w:t>
+            </w:r>
+          </w:p>
+        </w:tc>
+      </w:tr>
+      <w:tr>
+        <w:tc>
+          <w:tcPr>
+            <w:tcW w:type="dxa" w:w="3135"/>
+          </w:tcPr>
+          <w:p>
+            <w:r/>
+            <w:r>
+              <w:rPr>
+                <w:rFonts w:ascii="Calibri" w:hAnsi="Calibri"/>
+                <w:sz w:val="19"/>
+              </w:rPr>
+              <w:t>Temps d'entraînement + prédiction</w:t>
+            </w:r>
+          </w:p>
+        </w:tc>
+        <w:tc>
+          <w:tcPr>
+            <w:tcW w:type="dxa" w:w="3135"/>
+          </w:tcPr>
+          <w:p>
+            <w:r/>
+            <w:r>
+              <w:rPr>
+                <w:rFonts w:ascii="Calibri" w:hAnsi="Calibri"/>
+                <w:sz w:val="19"/>
+              </w:rPr>
+              <w:t>&lt; 100 ms</w:t>
+            </w:r>
+          </w:p>
+        </w:tc>
+        <w:tc>
+          <w:tcPr>
+            <w:tcW w:type="dxa" w:w="3135"/>
+          </w:tcPr>
+          <w:p>
+            <w:r/>
+            <w:r>
+              <w:rPr>
+                <w:rFonts w:ascii="Calibri" w:hAnsi="Calibri"/>
+                <w:sz w:val="19"/>
+              </w:rPr>
+              <w:t>Ré-entraînement complet à chaque appel</w:t>
+            </w:r>
+          </w:p>
+        </w:tc>
+      </w:tr>
+      <w:tr>
+        <w:tc>
+          <w:tcPr>
+            <w:tcW w:type="dxa" w:w="3135"/>
+          </w:tcPr>
+          <w:p>
+            <w:r/>
+            <w:r>
+              <w:rPr>
+                <w:rFonts w:ascii="Calibri" w:hAnsi="Calibri"/>
+                <w:sz w:val="19"/>
+              </w:rPr>
+              <w:t>Top-1 accuracy</w:t>
+            </w:r>
+          </w:p>
+        </w:tc>
+        <w:tc>
+          <w:tcPr>
+            <w:tcW w:type="dxa" w:w="3135"/>
+          </w:tcPr>
+          <w:p>
+            <w:r/>
+            <w:r>
+              <w:rPr>
+                <w:rFonts w:ascii="Calibri" w:hAnsi="Calibri"/>
+                <w:sz w:val="19"/>
+              </w:rPr>
+              <w:t>~80%</w:t>
+            </w:r>
+          </w:p>
+        </w:tc>
+        <w:tc>
+          <w:tcPr>
+            <w:tcW w:type="dxa" w:w="3135"/>
+          </w:tcPr>
+          <w:p>
+            <w:r/>
+            <w:r>
+              <w:rPr>
+                <w:rFonts w:ascii="Calibri" w:hAnsi="Calibri"/>
+                <w:sz w:val="19"/>
+              </w:rPr>
+              <w:t>Le bon domaine est le premier suggéré dans 80% des cas</w:t>
+            </w:r>
+          </w:p>
+        </w:tc>
+      </w:tr>
+      <w:tr>
+        <w:tc>
+          <w:tcPr>
+            <w:tcW w:type="dxa" w:w="3135"/>
+          </w:tcPr>
+          <w:p>
+            <w:r/>
+            <w:r>
+              <w:rPr>
+                <w:rFonts w:ascii="Calibri" w:hAnsi="Calibri"/>
+                <w:sz w:val="19"/>
+              </w:rPr>
+              <w:t>Top-3 accuracy</w:t>
+            </w:r>
+          </w:p>
+        </w:tc>
+        <w:tc>
+          <w:tcPr>
+            <w:tcW w:type="dxa" w:w="3135"/>
+          </w:tcPr>
+          <w:p>
+            <w:r/>
+            <w:r>
+              <w:rPr>
+                <w:rFonts w:ascii="Calibri" w:hAnsi="Calibri"/>
+                <w:sz w:val="19"/>
+              </w:rPr>
+              <w:t>~95%</w:t>
+            </w:r>
+          </w:p>
+        </w:tc>
+        <w:tc>
+          <w:tcPr>
+            <w:tcW w:type="dxa" w:w="3135"/>
+          </w:tcPr>
+          <w:p>
+            <w:r/>
+            <w:r>
+              <w:rPr>
+                <w:rFonts w:ascii="Calibri" w:hAnsi="Calibri"/>
+                <w:sz w:val="19"/>
+              </w:rPr>
+              <w:t>Le bon domaine est dans les 3 suggestions dans 95% des cas</w:t>
+            </w:r>
+          </w:p>
+        </w:tc>
+      </w:tr>
+      <w:tr>
+        <w:tc>
+          <w:tcPr>
+            <w:tcW w:type="dxa" w:w="3135"/>
+          </w:tcPr>
+          <w:p>
+            <w:r/>
+            <w:r>
+              <w:rPr>
+                <w:rFonts w:ascii="Calibri" w:hAnsi="Calibri"/>
+                <w:sz w:val="19"/>
+              </w:rPr>
+              <w:t>Nombre de classes</w:t>
+            </w:r>
+          </w:p>
+        </w:tc>
+        <w:tc>
+          <w:tcPr>
+            <w:tcW w:type="dxa" w:w="3135"/>
+          </w:tcPr>
+          <w:p>
+            <w:r/>
+            <w:r>
+              <w:rPr>
+                <w:rFonts w:ascii="Calibri" w:hAnsi="Calibri"/>
+                <w:sz w:val="19"/>
+              </w:rPr>
+              <w:t>8</w:t>
+            </w:r>
+          </w:p>
+        </w:tc>
+        <w:tc>
+          <w:tcPr>
+            <w:tcW w:type="dxa" w:w="3135"/>
+          </w:tcPr>
+          <w:p>
+            <w:r/>
+            <w:r>
+              <w:rPr>
+                <w:rFonts w:ascii="Calibri" w:hAnsi="Calibri"/>
+                <w:sz w:val="19"/>
+              </w:rPr>
+              <w:t>Correspondant aux 8 domaines de recherche de la plateforme</w:t>
+            </w:r>
+          </w:p>
+        </w:tc>
+      </w:tr>
+      <w:tr>
+        <w:tc>
+          <w:tcPr>
+            <w:tcW w:type="dxa" w:w="3135"/>
+          </w:tcPr>
+          <w:p>
+            <w:r/>
+            <w:r>
+              <w:rPr>
+                <w:rFonts w:ascii="Calibri" w:hAnsi="Calibri"/>
+                <w:sz w:val="19"/>
+              </w:rPr>
+              <w:t>Modèle</w:t>
+            </w:r>
+          </w:p>
+        </w:tc>
+        <w:tc>
+          <w:tcPr>
+            <w:tcW w:type="dxa" w:w="3135"/>
+          </w:tcPr>
+          <w:p>
+            <w:r/>
+            <w:r>
+              <w:rPr>
+                <w:rFonts w:ascii="Calibri" w:hAnsi="Calibri"/>
+                <w:sz w:val="19"/>
+              </w:rPr>
+              <w:t>TF-IDF + Logistic Regression</w:t>
+            </w:r>
+          </w:p>
+        </w:tc>
+        <w:tc>
+          <w:tcPr>
+            <w:tcW w:type="dxa" w:w="3135"/>
+          </w:tcPr>
+          <w:p>
+            <w:r/>
+            <w:r>
+              <w:rPr>
+                <w:rFonts w:ascii="Calibri" w:hAnsi="Calibri"/>
+                <w:sz w:val="19"/>
+              </w:rPr>
+              <w:t>Scikit-learn, aucune dépendance GPU</w:t>
+            </w:r>
+          </w:p>
+        </w:tc>
+      </w:tr>
+    </w:tbl>
+    <w:p/>
+    <w:p>
+      <w:r>
+        <w:t>Exemple de résultat pour un texte sur le NLP :</w:t>
+        <w:br/>
+        <w:t>Entrée : "Transformer-Based Named Entity Recognition for Biomedical Text Mining..."</w:t>
+        <w:br/>
+        <w:t>Prédictions :</w:t>
+        <w:br/>
+        <w:t xml:space="preserve">  1. Bio-informatique — 45.2% de confiance</w:t>
+        <w:br/>
+        <w:t xml:space="preserve">  2. Traitement du Langage Naturel — 38.7%</w:t>
+        <w:br/>
+        <w:t xml:space="preserve">  3. Domaines Émergents — 8.1%</w:t>
+      </w:r>
+    </w:p>
+    <w:p>
+      <w:pPr>
+        <w:pStyle w:val="Heading2"/>
+      </w:pPr>
+      <w:r>
+        <w:rPr>
+          <w:color w:val="1E293B"/>
+        </w:rPr>
+        <w:t>9.5 Intégration frontend</w:t>
+      </w:r>
+    </w:p>
+    <w:p>
+      <w:r>
+        <w:t>La classification est intégrée dans le formulaire d'ajout/modification de publication (Admin &gt; Publications) :</w:t>
+        <w:br/>
+        <w:t>• Un bouton "Suggérer le domaine (IA)" déclenche la classification.</w:t>
+        <w:br/>
+        <w:t>• Les top-3 domaines sont affichés avec des barres de confiance visuelles.</w:t>
+        <w:br/>
+        <w:t>• Un clic sur un domaine suggéré l'applique automatiquement dans le formulaire.</w:t>
+        <w:br/>
+        <w:t>• Les métriques du modèle (précision CV, nombre d'échantillons) sont affichées sous les prédictions.</w:t>
+      </w:r>
+    </w:p>
+    <w:p>
+      <w:r>
+        <w:br w:type="page"/>
+      </w:r>
+    </w:p>
+    <w:p>
+      <w:pPr>
+        <w:pStyle w:val="Heading1"/>
+      </w:pPr>
+      <w:r>
+        <w:rPr>
+          <w:color w:val="1E293B"/>
+        </w:rPr>
+        <w:t>10. Module 8 — Prédiction de tendances</w:t>
+      </w:r>
+    </w:p>
+    <w:p>
+      <w:pPr>
+        <w:pStyle w:val="Heading2"/>
+      </w:pPr>
+      <w:r>
+        <w:rPr>
+          <w:color w:val="1E293B"/>
+        </w:rPr>
+        <w:t>10.1 Choix de l'approche</w:t>
+      </w:r>
+    </w:p>
+    <w:p>
+      <w:r>
+        <w:t>La prédiction de tendances utilise une régression linéaire simple sur les comptages mensuels de publications par domaine. Cette approche est choisie pour sa transparence et son interprétabilité : la pente de la droite de régression indique directement si un domaine est en croissance, stable ou en déclin.</w:t>
+      </w:r>
+    </w:p>
+    <w:p>
+      <w:r>
+        <w:t>Contrairement aux autres modules IA qui nécessitent le microservice Python, la prédiction de tendances est calculée directement dans le backend Java (Spring Boot), ce qui garantit sa disponibilité même lorsque le service IA est arrêté.</w:t>
+      </w:r>
+    </w:p>
+    <w:p>
+      <w:pPr>
+        <w:pStyle w:val="Heading2"/>
+      </w:pPr>
+      <w:r>
+        <w:rPr>
+          <w:color w:val="1E293B"/>
+        </w:rPr>
+        <w:t>10.2 Algorithme</w:t>
+      </w:r>
+    </w:p>
+    <w:p>
+      <w:r>
+        <w:t>L'algorithme procède en quatre étapes :</w:t>
+        <w:br/>
+        <w:br/>
+        <w:t>1. Agrégation mensuelle : pour chaque domaine, les publications sont groupées par mois (format YYYY-MM) en utilisant la date de publication.</w:t>
+        <w:br/>
+        <w:br/>
+        <w:t>2. Régression linéaire : une droite y = ax + b est ajustée sur les comptages mensuels de chaque domaine, où x est l'index du mois et y le nombre de publications. La pente a (slope) est calculée par la méthode des moindres carrés ordinaires :</w:t>
+        <w:br/>
+        <w:t xml:space="preserve">   a = Σ(xi - x̄)(yi - ȳ) / Σ(xi - x̄)²</w:t>
+        <w:br/>
+        <w:br/>
+        <w:t>3. Classification de tendance :</w:t>
+        <w:br/>
+        <w:t xml:space="preserve">   — Pente &gt; 0.05 → En hausse (rising) : le domaine produit de plus en plus de publications</w:t>
+        <w:br/>
+        <w:t xml:space="preserve">   — Pente &lt; -0.05 → En baisse (declining) : l'activité du domaine ralentit</w:t>
+        <w:br/>
+        <w:t xml:space="preserve">   — -0.05 ≤ pente ≤ 0.05 → Stable : production constante</w:t>
+        <w:br/>
+        <w:br/>
+        <w:t>4. Tri : les domaines sont retournés triés par pente décroissante (les plus dynamiques en premier).</w:t>
+      </w:r>
+    </w:p>
+    <w:p>
+      <w:pPr>
+        <w:pStyle w:val="Heading2"/>
+      </w:pPr>
+      <w:r>
+        <w:rPr>
+          <w:color w:val="1E293B"/>
+        </w:rPr>
+        <w:t>10.3 Paramétrage</w:t>
+      </w:r>
+    </w:p>
+    <w:tbl>
+      <w:tblPr>
+        <w:tblStyle w:val="LightGrid-Accent1"/>
+        <w:tblW w:type="auto" w:w="0"/>
+        <w:jc w:val="center"/>
+        <w:tblLook w:firstColumn="1" w:firstRow="1" w:lastColumn="0" w:lastRow="0" w:noHBand="0" w:noVBand="1" w:val="04A0"/>
+      </w:tblPr>
+      <w:tblGrid>
+        <w:gridCol w:w="3135"/>
+        <w:gridCol w:w="3135"/>
+        <w:gridCol w:w="3135"/>
+      </w:tblGrid>
+      <w:tr>
+        <w:tc>
+          <w:tcPr>
+            <w:tcW w:type="dxa" w:w="3135"/>
+          </w:tcPr>
+          <w:p>
+            <w:r/>
+            <w:r>
+              <w:rPr>
+                <w:rFonts w:ascii="Calibri" w:hAnsi="Calibri"/>
+                <w:b/>
+                <w:color w:val="2563EB"/>
+                <w:sz w:val="19"/>
+              </w:rPr>
+              <w:t>Paramètre</w:t>
+            </w:r>
+          </w:p>
+        </w:tc>
+        <w:tc>
+          <w:tcPr>
+            <w:tcW w:type="dxa" w:w="3135"/>
+          </w:tcPr>
+          <w:p>
+            <w:r/>
+            <w:r>
+              <w:rPr>
+                <w:rFonts w:ascii="Calibri" w:hAnsi="Calibri"/>
+                <w:b/>
+                <w:color w:val="2563EB"/>
+                <w:sz w:val="19"/>
+              </w:rPr>
+              <w:t>Valeur</w:t>
+            </w:r>
+          </w:p>
+        </w:tc>
+        <w:tc>
+          <w:tcPr>
+            <w:tcW w:type="dxa" w:w="3135"/>
+          </w:tcPr>
+          <w:p>
+            <w:r/>
+            <w:r>
+              <w:rPr>
+                <w:rFonts w:ascii="Calibri" w:hAnsi="Calibri"/>
+                <w:b/>
+                <w:color w:val="2563EB"/>
+                <w:sz w:val="19"/>
+              </w:rPr>
+              <w:t>Justification</w:t>
+            </w:r>
+          </w:p>
+        </w:tc>
+      </w:tr>
+      <w:tr>
+        <w:tc>
+          <w:tcPr>
+            <w:tcW w:type="dxa" w:w="3135"/>
+          </w:tcPr>
+          <w:p>
+            <w:r/>
+            <w:r>
+              <w:rPr>
+                <w:rFonts w:ascii="Calibri" w:hAnsi="Calibri"/>
+                <w:sz w:val="19"/>
+              </w:rPr>
+              <w:t>Granularité temporelle</w:t>
+            </w:r>
+          </w:p>
+        </w:tc>
+        <w:tc>
+          <w:tcPr>
+            <w:tcW w:type="dxa" w:w="3135"/>
+          </w:tcPr>
+          <w:p>
+            <w:r/>
+            <w:r>
+              <w:rPr>
+                <w:rFonts w:ascii="Calibri" w:hAnsi="Calibri"/>
+                <w:sz w:val="19"/>
+              </w:rPr>
+              <w:t>Mensuelle</w:t>
+            </w:r>
+          </w:p>
+        </w:tc>
+        <w:tc>
+          <w:tcPr>
+            <w:tcW w:type="dxa" w:w="3135"/>
+          </w:tcPr>
+          <w:p>
+            <w:r/>
+            <w:r>
+              <w:rPr>
+                <w:rFonts w:ascii="Calibri" w:hAnsi="Calibri"/>
+                <w:sz w:val="19"/>
+              </w:rPr>
+              <w:t>Compromis entre précision et lissage du bruit</w:t>
+            </w:r>
+          </w:p>
+        </w:tc>
+      </w:tr>
+      <w:tr>
+        <w:tc>
+          <w:tcPr>
+            <w:tcW w:type="dxa" w:w="3135"/>
+          </w:tcPr>
+          <w:p>
+            <w:r/>
+            <w:r>
+              <w:rPr>
+                <w:rFonts w:ascii="Calibri" w:hAnsi="Calibri"/>
+                <w:sz w:val="19"/>
+              </w:rPr>
+              <w:t>Seuil hausse</w:t>
+            </w:r>
+          </w:p>
+        </w:tc>
+        <w:tc>
+          <w:tcPr>
+            <w:tcW w:type="dxa" w:w="3135"/>
+          </w:tcPr>
+          <w:p>
+            <w:r/>
+            <w:r>
+              <w:rPr>
+                <w:rFonts w:ascii="Calibri" w:hAnsi="Calibri"/>
+                <w:sz w:val="19"/>
+              </w:rPr>
+              <w:t>&gt; 0.05</w:t>
+            </w:r>
+          </w:p>
+        </w:tc>
+        <w:tc>
+          <w:tcPr>
+            <w:tcW w:type="dxa" w:w="3135"/>
+          </w:tcPr>
+          <w:p>
+            <w:r/>
+            <w:r>
+              <w:rPr>
+                <w:rFonts w:ascii="Calibri" w:hAnsi="Calibri"/>
+                <w:sz w:val="19"/>
+              </w:rPr>
+              <w:t>Évite les faux positifs dus aux fluctuations naturelles</w:t>
+            </w:r>
+          </w:p>
+        </w:tc>
+      </w:tr>
+      <w:tr>
+        <w:tc>
+          <w:tcPr>
+            <w:tcW w:type="dxa" w:w="3135"/>
+          </w:tcPr>
+          <w:p>
+            <w:r/>
+            <w:r>
+              <w:rPr>
+                <w:rFonts w:ascii="Calibri" w:hAnsi="Calibri"/>
+                <w:sz w:val="19"/>
+              </w:rPr>
+              <w:t>Seuil baisse</w:t>
+            </w:r>
+          </w:p>
+        </w:tc>
+        <w:tc>
+          <w:tcPr>
+            <w:tcW w:type="dxa" w:w="3135"/>
+          </w:tcPr>
+          <w:p>
+            <w:r/>
+            <w:r>
+              <w:rPr>
+                <w:rFonts w:ascii="Calibri" w:hAnsi="Calibri"/>
+                <w:sz w:val="19"/>
+              </w:rPr>
+              <w:t>&lt; -0.05</w:t>
+            </w:r>
+          </w:p>
+        </w:tc>
+        <w:tc>
+          <w:tcPr>
+            <w:tcW w:type="dxa" w:w="3135"/>
+          </w:tcPr>
+          <w:p>
+            <w:r/>
+            <w:r>
+              <w:rPr>
+                <w:rFonts w:ascii="Calibri" w:hAnsi="Calibri"/>
+                <w:sz w:val="19"/>
+              </w:rPr>
+              <w:t>Symétrique au seuil de hausse</w:t>
+            </w:r>
+          </w:p>
+        </w:tc>
+      </w:tr>
+      <w:tr>
+        <w:tc>
+          <w:tcPr>
+            <w:tcW w:type="dxa" w:w="3135"/>
+          </w:tcPr>
+          <w:p>
+            <w:r/>
+            <w:r>
+              <w:rPr>
+                <w:rFonts w:ascii="Calibri" w:hAnsi="Calibri"/>
+                <w:sz w:val="19"/>
+              </w:rPr>
+              <w:t>Minimum de mois</w:t>
+            </w:r>
+          </w:p>
+        </w:tc>
+        <w:tc>
+          <w:tcPr>
+            <w:tcW w:type="dxa" w:w="3135"/>
+          </w:tcPr>
+          <w:p>
+            <w:r/>
+            <w:r>
+              <w:rPr>
+                <w:rFonts w:ascii="Calibri" w:hAnsi="Calibri"/>
+                <w:sz w:val="19"/>
+              </w:rPr>
+              <w:t>2</w:t>
+            </w:r>
+          </w:p>
+        </w:tc>
+        <w:tc>
+          <w:tcPr>
+            <w:tcW w:type="dxa" w:w="3135"/>
+          </w:tcPr>
+          <w:p>
+            <w:r/>
+            <w:r>
+              <w:rPr>
+                <w:rFonts w:ascii="Calibri" w:hAnsi="Calibri"/>
+                <w:sz w:val="19"/>
+              </w:rPr>
+              <w:t>Au moins 2 points pour calculer une pente</w:t>
+            </w:r>
+          </w:p>
+        </w:tc>
+      </w:tr>
+      <w:tr>
+        <w:tc>
+          <w:tcPr>
+            <w:tcW w:type="dxa" w:w="3135"/>
+          </w:tcPr>
+          <w:p>
+            <w:r/>
+            <w:r>
+              <w:rPr>
+                <w:rFonts w:ascii="Calibri" w:hAnsi="Calibri"/>
+                <w:sz w:val="19"/>
+              </w:rPr>
+              <w:t>Méthode de régression</w:t>
+            </w:r>
+          </w:p>
+        </w:tc>
+        <w:tc>
+          <w:tcPr>
+            <w:tcW w:type="dxa" w:w="3135"/>
+          </w:tcPr>
+          <w:p>
+            <w:r/>
+            <w:r>
+              <w:rPr>
+                <w:rFonts w:ascii="Calibri" w:hAnsi="Calibri"/>
+                <w:sz w:val="19"/>
+              </w:rPr>
+              <w:t>Moindres carrés ordinaires (OLS)</w:t>
+            </w:r>
+          </w:p>
+        </w:tc>
+        <w:tc>
+          <w:tcPr>
+            <w:tcW w:type="dxa" w:w="3135"/>
+          </w:tcPr>
+          <w:p>
+            <w:r/>
+            <w:r>
+              <w:rPr>
+                <w:rFonts w:ascii="Calibri" w:hAnsi="Calibri"/>
+                <w:sz w:val="19"/>
+              </w:rPr>
+              <w:t>Simple, déterministe, interprétable</w:t>
+            </w:r>
+          </w:p>
+        </w:tc>
+      </w:tr>
+      <w:tr>
+        <w:tc>
+          <w:tcPr>
+            <w:tcW w:type="dxa" w:w="3135"/>
+          </w:tcPr>
+          <w:p>
+            <w:r/>
+            <w:r>
+              <w:rPr>
+                <w:rFonts w:ascii="Calibri" w:hAnsi="Calibri"/>
+                <w:sz w:val="19"/>
+              </w:rPr>
+              <w:t>Calcul</w:t>
+            </w:r>
+          </w:p>
+        </w:tc>
+        <w:tc>
+          <w:tcPr>
+            <w:tcW w:type="dxa" w:w="3135"/>
+          </w:tcPr>
+          <w:p>
+            <w:r/>
+            <w:r>
+              <w:rPr>
+                <w:rFonts w:ascii="Calibri" w:hAnsi="Calibri"/>
+                <w:sz w:val="19"/>
+              </w:rPr>
+              <w:t>Backend Java (pas de dépendance IA)</w:t>
+            </w:r>
+          </w:p>
+        </w:tc>
+        <w:tc>
+          <w:tcPr>
+            <w:tcW w:type="dxa" w:w="3135"/>
+          </w:tcPr>
+          <w:p>
+            <w:r/>
+            <w:r>
+              <w:rPr>
+                <w:rFonts w:ascii="Calibri" w:hAnsi="Calibri"/>
+                <w:sz w:val="19"/>
+              </w:rPr>
+              <w:t>Disponibilité garantie</w:t>
+            </w:r>
+          </w:p>
+        </w:tc>
+      </w:tr>
+    </w:tbl>
+    <w:p/>
+    <w:p>
+      <w:pPr>
+        <w:pStyle w:val="Heading2"/>
+      </w:pPr>
+      <w:r>
+        <w:rPr>
+          <w:color w:val="1E293B"/>
+        </w:rPr>
+        <w:t>10.4 Métriques et résultats</w:t>
+      </w:r>
+    </w:p>
+    <w:tbl>
+      <w:tblPr>
+        <w:tblStyle w:val="LightGrid-Accent1"/>
+        <w:tblW w:type="auto" w:w="0"/>
+        <w:jc w:val="center"/>
+        <w:tblLook w:firstColumn="1" w:firstRow="1" w:lastColumn="0" w:lastRow="0" w:noHBand="0" w:noVBand="1" w:val="04A0"/>
+      </w:tblPr>
+      <w:tblGrid>
+        <w:gridCol w:w="3135"/>
+        <w:gridCol w:w="3135"/>
+        <w:gridCol w:w="3135"/>
+      </w:tblGrid>
+      <w:tr>
+        <w:tc>
+          <w:tcPr>
+            <w:tcW w:type="dxa" w:w="3135"/>
+          </w:tcPr>
+          <w:p>
+            <w:r/>
+            <w:r>
+              <w:rPr>
+                <w:rFonts w:ascii="Calibri" w:hAnsi="Calibri"/>
+                <w:b/>
+                <w:color w:val="2563EB"/>
+                <w:sz w:val="19"/>
+              </w:rPr>
+              <w:t>Métrique</w:t>
+            </w:r>
+          </w:p>
+        </w:tc>
+        <w:tc>
+          <w:tcPr>
+            <w:tcW w:type="dxa" w:w="3135"/>
+          </w:tcPr>
+          <w:p>
+            <w:r/>
+            <w:r>
+              <w:rPr>
+                <w:rFonts w:ascii="Calibri" w:hAnsi="Calibri"/>
+                <w:b/>
+                <w:color w:val="2563EB"/>
+                <w:sz w:val="19"/>
+              </w:rPr>
+              <w:t>Valeur</w:t>
+            </w:r>
+          </w:p>
+        </w:tc>
+        <w:tc>
+          <w:tcPr>
+            <w:tcW w:type="dxa" w:w="3135"/>
+          </w:tcPr>
+          <w:p>
+            <w:r/>
+            <w:r>
+              <w:rPr>
+                <w:rFonts w:ascii="Calibri" w:hAnsi="Calibri"/>
+                <w:b/>
+                <w:color w:val="2563EB"/>
+                <w:sz w:val="19"/>
+              </w:rPr>
+              <w:t>Conditions</w:t>
+            </w:r>
+          </w:p>
+        </w:tc>
+      </w:tr>
+      <w:tr>
+        <w:tc>
+          <w:tcPr>
+            <w:tcW w:type="dxa" w:w="3135"/>
+          </w:tcPr>
+          <w:p>
+            <w:r/>
+            <w:r>
+              <w:rPr>
+                <w:rFonts w:ascii="Calibri" w:hAnsi="Calibri"/>
+                <w:sz w:val="19"/>
+              </w:rPr>
+              <w:t>Temps de calcul</w:t>
+            </w:r>
+          </w:p>
+        </w:tc>
+        <w:tc>
+          <w:tcPr>
+            <w:tcW w:type="dxa" w:w="3135"/>
+          </w:tcPr>
+          <w:p>
+            <w:r/>
+            <w:r>
+              <w:rPr>
+                <w:rFonts w:ascii="Calibri" w:hAnsi="Calibri"/>
+                <w:sz w:val="19"/>
+              </w:rPr>
+              <w:t>&lt; 5 ms</w:t>
+            </w:r>
+          </w:p>
+        </w:tc>
+        <w:tc>
+          <w:tcPr>
+            <w:tcW w:type="dxa" w:w="3135"/>
+          </w:tcPr>
+          <w:p>
+            <w:r/>
+            <w:r>
+              <w:rPr>
+                <w:rFonts w:ascii="Calibri" w:hAnsi="Calibri"/>
+                <w:sz w:val="19"/>
+              </w:rPr>
+              <w:t>Calcul linéaire sur le corpus complet</w:t>
+            </w:r>
+          </w:p>
+        </w:tc>
+      </w:tr>
+      <w:tr>
+        <w:tc>
+          <w:tcPr>
+            <w:tcW w:type="dxa" w:w="3135"/>
+          </w:tcPr>
+          <w:p>
+            <w:r/>
+            <w:r>
+              <w:rPr>
+                <w:rFonts w:ascii="Calibri" w:hAnsi="Calibri"/>
+                <w:sz w:val="19"/>
+              </w:rPr>
+              <w:t>Précision de la tendance</w:t>
+            </w:r>
+          </w:p>
+        </w:tc>
+        <w:tc>
+          <w:tcPr>
+            <w:tcW w:type="dxa" w:w="3135"/>
+          </w:tcPr>
+          <w:p>
+            <w:r/>
+            <w:r>
+              <w:rPr>
+                <w:rFonts w:ascii="Calibri" w:hAnsi="Calibri"/>
+                <w:sz w:val="19"/>
+              </w:rPr>
+              <w:t>Déterministe</w:t>
+            </w:r>
+          </w:p>
+        </w:tc>
+        <w:tc>
+          <w:tcPr>
+            <w:tcW w:type="dxa" w:w="3135"/>
+          </w:tcPr>
+          <w:p>
+            <w:r/>
+            <w:r>
+              <w:rPr>
+                <w:rFonts w:ascii="Calibri" w:hAnsi="Calibri"/>
+                <w:sz w:val="19"/>
+              </w:rPr>
+              <w:t>Calcul exact basé sur les données réelles, pas une estimation</w:t>
+            </w:r>
+          </w:p>
+        </w:tc>
+      </w:tr>
+      <w:tr>
+        <w:tc>
+          <w:tcPr>
+            <w:tcW w:type="dxa" w:w="3135"/>
+          </w:tcPr>
+          <w:p>
+            <w:r/>
+            <w:r>
+              <w:rPr>
+                <w:rFonts w:ascii="Calibri" w:hAnsi="Calibri"/>
+                <w:sz w:val="19"/>
+              </w:rPr>
+              <w:t>Fenêtre d'analyse</w:t>
+            </w:r>
+          </w:p>
+        </w:tc>
+        <w:tc>
+          <w:tcPr>
+            <w:tcW w:type="dxa" w:w="3135"/>
+          </w:tcPr>
+          <w:p>
+            <w:r/>
+            <w:r>
+              <w:rPr>
+                <w:rFonts w:ascii="Calibri" w:hAnsi="Calibri"/>
+                <w:sz w:val="19"/>
+              </w:rPr>
+              <w:t>Tout l'historique</w:t>
+            </w:r>
+          </w:p>
+        </w:tc>
+        <w:tc>
+          <w:tcPr>
+            <w:tcW w:type="dxa" w:w="3135"/>
+          </w:tcPr>
+          <w:p>
+            <w:r/>
+            <w:r>
+              <w:rPr>
+                <w:rFonts w:ascii="Calibri" w:hAnsi="Calibri"/>
+                <w:sz w:val="19"/>
+              </w:rPr>
+              <w:t>Prend en compte toutes les publications depuis le début</w:t>
+            </w:r>
+          </w:p>
+        </w:tc>
+      </w:tr>
+      <w:tr>
+        <w:tc>
+          <w:tcPr>
+            <w:tcW w:type="dxa" w:w="3135"/>
+          </w:tcPr>
+          <w:p>
+            <w:r/>
+            <w:r>
+              <w:rPr>
+                <w:rFonts w:ascii="Calibri" w:hAnsi="Calibri"/>
+                <w:sz w:val="19"/>
+              </w:rPr>
+              <w:t>Nombre de domaines analysés</w:t>
+            </w:r>
+          </w:p>
+        </w:tc>
+        <w:tc>
+          <w:tcPr>
+            <w:tcW w:type="dxa" w:w="3135"/>
+          </w:tcPr>
+          <w:p>
+            <w:r/>
+            <w:r>
+              <w:rPr>
+                <w:rFonts w:ascii="Calibri" w:hAnsi="Calibri"/>
+                <w:sz w:val="19"/>
+              </w:rPr>
+              <w:t>8</w:t>
+            </w:r>
+          </w:p>
+        </w:tc>
+        <w:tc>
+          <w:tcPr>
+            <w:tcW w:type="dxa" w:w="3135"/>
+          </w:tcPr>
+          <w:p>
+            <w:r/>
+            <w:r>
+              <w:rPr>
+                <w:rFonts w:ascii="Calibri" w:hAnsi="Calibri"/>
+                <w:sz w:val="19"/>
+              </w:rPr>
+              <w:t>Un résultat par domaine existant</w:t>
+            </w:r>
+          </w:p>
+        </w:tc>
+      </w:tr>
+      <w:tr>
+        <w:tc>
+          <w:tcPr>
+            <w:tcW w:type="dxa" w:w="3135"/>
+          </w:tcPr>
+          <w:p>
+            <w:r/>
+            <w:r>
+              <w:rPr>
+                <w:rFonts w:ascii="Calibri" w:hAnsi="Calibri"/>
+                <w:sz w:val="19"/>
+              </w:rPr>
+              <w:t>Dépendance service IA</w:t>
+            </w:r>
+          </w:p>
+        </w:tc>
+        <w:tc>
+          <w:tcPr>
+            <w:tcW w:type="dxa" w:w="3135"/>
+          </w:tcPr>
+          <w:p>
+            <w:r/>
+            <w:r>
+              <w:rPr>
+                <w:rFonts w:ascii="Calibri" w:hAnsi="Calibri"/>
+                <w:sz w:val="19"/>
+              </w:rPr>
+              <w:t>Aucune</w:t>
+            </w:r>
+          </w:p>
+        </w:tc>
+        <w:tc>
+          <w:tcPr>
+            <w:tcW w:type="dxa" w:w="3135"/>
+          </w:tcPr>
+          <w:p>
+            <w:r/>
+            <w:r>
+              <w:rPr>
+                <w:rFonts w:ascii="Calibri" w:hAnsi="Calibri"/>
+                <w:sz w:val="19"/>
+              </w:rPr>
+              <w:t>Calculé directement dans le backend Java</w:t>
+            </w:r>
+          </w:p>
+        </w:tc>
+      </w:tr>
+    </w:tbl>
+    <w:p/>
+    <w:p>
+      <w:r>
+        <w:t>Exemple de résultat avec les données de la plateforme :</w:t>
+        <w:br/>
+        <w:t xml:space="preserve">  • Traitement du Langage Naturel — 6 publications, pente +0.12 → En hausse</w:t>
+        <w:br/>
+        <w:t xml:space="preserve">  • Éthique &amp; IA — 4 publications, pente +0.08 → En hausse</w:t>
+        <w:br/>
+        <w:t xml:space="preserve">  • Informatique Quantique — 3 publications, pente +0.02 → Stable</w:t>
+        <w:br/>
+        <w:t xml:space="preserve">  • Cybersécurité IA — 3 publications, pente -0.06 → En baisse</w:t>
+      </w:r>
+    </w:p>
+    <w:p>
+      <w:pPr>
+        <w:pStyle w:val="Heading2"/>
+      </w:pPr>
+      <w:r>
+        <w:rPr>
+          <w:color w:val="1E293B"/>
+        </w:rPr>
+        <w:t>10.5 Intégration frontend</w:t>
+      </w:r>
+    </w:p>
+    <w:p>
+      <w:r>
+        <w:t>Les tendances sont affichées dans le Dashboard Admin sous les graphiques :</w:t>
+        <w:br/>
+        <w:t>• Chaque domaine est présenté avec son nombre total de publications.</w:t>
+        <w:br/>
+        <w:t>• Un indicateur visuel coloré indique la tendance : vert (En hausse), gris (Stable), rouge (En baisse).</w:t>
+        <w:br/>
+        <w:t>• La pente est affichée en pourcentage pour quantifier la dynamique.</w:t>
+        <w:br/>
+        <w:t>• Si le service est indisponible, un message explicite est affiché.</w:t>
+      </w:r>
+    </w:p>
+    <w:p>
+      <w:r>
+        <w:br w:type="page"/>
+      </w:r>
+    </w:p>
+    <w:p>
+      <w:pPr>
+        <w:pStyle w:val="Heading1"/>
+      </w:pPr>
+      <w:r>
+        <w:rPr>
+          <w:color w:val="1E293B"/>
+        </w:rPr>
+        <w:t>11. Tableau récapitulatif des modèles</w:t>
       </w:r>
     </w:p>
     <w:tbl>
@@ -5284,6 +7028,160 @@
           </w:p>
         </w:tc>
       </w:tr>
+      <w:tr>
+        <w:tc>
+          <w:tcPr>
+            <w:tcW w:type="dxa" w:w="1881"/>
+          </w:tcPr>
+          <w:p>
+            <w:r/>
+            <w:r>
+              <w:rPr>
+                <w:rFonts w:ascii="Calibri" w:hAnsi="Calibri"/>
+                <w:sz w:val="19"/>
+              </w:rPr>
+              <w:t>Classification</w:t>
+            </w:r>
+          </w:p>
+        </w:tc>
+        <w:tc>
+          <w:tcPr>
+            <w:tcW w:type="dxa" w:w="1881"/>
+          </w:tcPr>
+          <w:p>
+            <w:r/>
+            <w:r>
+              <w:rPr>
+                <w:rFonts w:ascii="Calibri" w:hAnsi="Calibri"/>
+                <w:sz w:val="19"/>
+              </w:rPr>
+              <w:t>TF-IDF + Logistic Regression</w:t>
+            </w:r>
+          </w:p>
+        </w:tc>
+        <w:tc>
+          <w:tcPr>
+            <w:tcW w:type="dxa" w:w="1881"/>
+          </w:tcPr>
+          <w:p>
+            <w:r/>
+            <w:r>
+              <w:rPr>
+                <w:rFonts w:ascii="Calibri" w:hAnsi="Calibri"/>
+                <w:sz w:val="19"/>
+              </w:rPr>
+              <w:t>Supervisé</w:t>
+            </w:r>
+          </w:p>
+        </w:tc>
+        <w:tc>
+          <w:tcPr>
+            <w:tcW w:type="dxa" w:w="1881"/>
+          </w:tcPr>
+          <w:p>
+            <w:r/>
+            <w:r>
+              <w:rPr>
+                <w:rFonts w:ascii="Calibri" w:hAnsi="Calibri"/>
+                <w:sz w:val="19"/>
+              </w:rPr>
+              <w:t>Texte + corpus étiqueté</w:t>
+            </w:r>
+          </w:p>
+        </w:tc>
+        <w:tc>
+          <w:tcPr>
+            <w:tcW w:type="dxa" w:w="1881"/>
+          </w:tcPr>
+          <w:p>
+            <w:r/>
+            <w:r>
+              <w:rPr>
+                <w:rFonts w:ascii="Calibri" w:hAnsi="Calibri"/>
+                <w:sz w:val="19"/>
+              </w:rPr>
+              <w:t>Top-N domaines + confiances + métriques CV</w:t>
+            </w:r>
+          </w:p>
+        </w:tc>
+      </w:tr>
+      <w:tr>
+        <w:tc>
+          <w:tcPr>
+            <w:tcW w:type="dxa" w:w="1881"/>
+          </w:tcPr>
+          <w:p>
+            <w:r/>
+            <w:r>
+              <w:rPr>
+                <w:rFonts w:ascii="Calibri" w:hAnsi="Calibri"/>
+                <w:sz w:val="19"/>
+              </w:rPr>
+              <w:t>Prédiction tendances</w:t>
+            </w:r>
+          </w:p>
+        </w:tc>
+        <w:tc>
+          <w:tcPr>
+            <w:tcW w:type="dxa" w:w="1881"/>
+          </w:tcPr>
+          <w:p>
+            <w:r/>
+            <w:r>
+              <w:rPr>
+                <w:rFonts w:ascii="Calibri" w:hAnsi="Calibri"/>
+                <w:sz w:val="19"/>
+              </w:rPr>
+              <w:t>Régression linéaire (OLS)</w:t>
+            </w:r>
+          </w:p>
+        </w:tc>
+        <w:tc>
+          <w:tcPr>
+            <w:tcW w:type="dxa" w:w="1881"/>
+          </w:tcPr>
+          <w:p>
+            <w:r/>
+            <w:r>
+              <w:rPr>
+                <w:rFonts w:ascii="Calibri" w:hAnsi="Calibri"/>
+                <w:sz w:val="19"/>
+              </w:rPr>
+              <w:t>Statistique</w:t>
+            </w:r>
+          </w:p>
+        </w:tc>
+        <w:tc>
+          <w:tcPr>
+            <w:tcW w:type="dxa" w:w="1881"/>
+          </w:tcPr>
+          <w:p>
+            <w:r/>
+            <w:r>
+              <w:rPr>
+                <w:rFonts w:ascii="Calibri" w:hAnsi="Calibri"/>
+                <w:sz w:val="19"/>
+              </w:rPr>
+              <w:t>Dates de publication par domaine</w:t>
+            </w:r>
+          </w:p>
+        </w:tc>
+        <w:tc>
+          <w:tcPr>
+            <w:tcW w:type="dxa" w:w="1881"/>
+          </w:tcPr>
+          <w:p>
+            <w:r/>
+            <w:r>
+              <w:rPr>
+                <w:rFonts w:ascii="Calibri" w:hAnsi="Calibri"/>
+                <w:sz w:val="19"/>
+              </w:rPr>
+              <w:t>Tendance (hausse/stable/baisse) + pente</w:t>
+            </w:r>
+          </w:p>
+        </w:tc>
+      </w:tr>
     </w:tbl>
     <w:p/>
     <w:p>
@@ -5294,7 +7192,7 @@
         <w:rPr>
           <w:color w:val="1E293B"/>
         </w:rPr>
-        <w:t>10. Métriques et évaluation</w:t>
+        <w:t>12. Métriques et évaluation</w:t>
       </w:r>
     </w:p>
     <w:p>
@@ -5305,7 +7203,7 @@
         <w:rPr>
           <w:color w:val="1E293B"/>
         </w:rPr>
-        <w:t>10.1 Métriques de performance</w:t>
+        <w:t>12.1 Métriques de performance</w:t>
       </w:r>
     </w:p>
     <w:tbl>
@@ -5763,6 +7661,130 @@
           </w:p>
         </w:tc>
       </w:tr>
+      <w:tr>
+        <w:tc>
+          <w:tcPr>
+            <w:tcW w:type="dxa" w:w="2351"/>
+          </w:tcPr>
+          <w:p>
+            <w:r/>
+            <w:r>
+              <w:rPr>
+                <w:rFonts w:ascii="Calibri" w:hAnsi="Calibri"/>
+                <w:sz w:val="19"/>
+              </w:rPr>
+              <w:t>Classification (TF-IDF + LR)</w:t>
+            </w:r>
+          </w:p>
+        </w:tc>
+        <w:tc>
+          <w:tcPr>
+            <w:tcW w:type="dxa" w:w="2351"/>
+          </w:tcPr>
+          <w:p>
+            <w:r/>
+            <w:r>
+              <w:rPr>
+                <w:rFonts w:ascii="Calibri" w:hAnsi="Calibri"/>
+                <w:sz w:val="19"/>
+              </w:rPr>
+              <w:t>&lt; 100 ms</w:t>
+            </w:r>
+          </w:p>
+        </w:tc>
+        <w:tc>
+          <w:tcPr>
+            <w:tcW w:type="dxa" w:w="2351"/>
+          </w:tcPr>
+          <w:p>
+            <w:r/>
+            <w:r>
+              <w:rPr>
+                <w:rFonts w:ascii="Calibri" w:hAnsi="Calibri"/>
+                <w:sz w:val="19"/>
+              </w:rPr>
+              <w:t>~15 Mo</w:t>
+            </w:r>
+          </w:p>
+        </w:tc>
+        <w:tc>
+          <w:tcPr>
+            <w:tcW w:type="dxa" w:w="2351"/>
+          </w:tcPr>
+          <w:p>
+            <w:r/>
+            <w:r>
+              <w:rPr>
+                <w:rFonts w:ascii="Calibri" w:hAnsi="Calibri"/>
+                <w:sz w:val="19"/>
+              </w:rPr>
+              <w:t>CPU uniquement</w:t>
+            </w:r>
+          </w:p>
+        </w:tc>
+      </w:tr>
+      <w:tr>
+        <w:tc>
+          <w:tcPr>
+            <w:tcW w:type="dxa" w:w="2351"/>
+          </w:tcPr>
+          <w:p>
+            <w:r/>
+            <w:r>
+              <w:rPr>
+                <w:rFonts w:ascii="Calibri" w:hAnsi="Calibri"/>
+                <w:sz w:val="19"/>
+              </w:rPr>
+              <w:t>Prédiction de tendances</w:t>
+            </w:r>
+          </w:p>
+        </w:tc>
+        <w:tc>
+          <w:tcPr>
+            <w:tcW w:type="dxa" w:w="2351"/>
+          </w:tcPr>
+          <w:p>
+            <w:r/>
+            <w:r>
+              <w:rPr>
+                <w:rFonts w:ascii="Calibri" w:hAnsi="Calibri"/>
+                <w:sz w:val="19"/>
+              </w:rPr>
+              <w:t>&lt; 5 ms</w:t>
+            </w:r>
+          </w:p>
+        </w:tc>
+        <w:tc>
+          <w:tcPr>
+            <w:tcW w:type="dxa" w:w="2351"/>
+          </w:tcPr>
+          <w:p>
+            <w:r/>
+            <w:r>
+              <w:rPr>
+                <w:rFonts w:ascii="Calibri" w:hAnsi="Calibri"/>
+                <w:sz w:val="19"/>
+              </w:rPr>
+              <w:t>&lt; 1 Mo</w:t>
+            </w:r>
+          </w:p>
+        </w:tc>
+        <w:tc>
+          <w:tcPr>
+            <w:tcW w:type="dxa" w:w="2351"/>
+          </w:tcPr>
+          <w:p>
+            <w:r/>
+            <w:r>
+              <w:rPr>
+                <w:rFonts w:ascii="Calibri" w:hAnsi="Calibri"/>
+                <w:sz w:val="19"/>
+              </w:rPr>
+              <w:t>CPU (backend Java)</w:t>
+            </w:r>
+          </w:p>
+        </w:tc>
+      </w:tr>
     </w:tbl>
     <w:p/>
     <w:p>
@@ -5773,7 +7795,7 @@
         <w:rPr>
           <w:color w:val="1E293B"/>
         </w:rPr>
-        <w:t>10.2 Métriques de qualité</w:t>
+        <w:t>12.2 Métriques de qualité</w:t>
       </w:r>
     </w:p>
     <w:tbl>
@@ -6293,6 +8315,192 @@
           </w:p>
         </w:tc>
       </w:tr>
+      <w:tr>
+        <w:tc>
+          <w:tcPr>
+            <w:tcW w:type="dxa" w:w="2351"/>
+          </w:tcPr>
+          <w:p>
+            <w:r/>
+            <w:r>
+              <w:rPr>
+                <w:rFonts w:ascii="Calibri" w:hAnsi="Calibri"/>
+                <w:sz w:val="19"/>
+              </w:rPr>
+              <w:t>Classification</w:t>
+            </w:r>
+          </w:p>
+        </w:tc>
+        <w:tc>
+          <w:tcPr>
+            <w:tcW w:type="dxa" w:w="2351"/>
+          </w:tcPr>
+          <w:p>
+            <w:r/>
+            <w:r>
+              <w:rPr>
+                <w:rFonts w:ascii="Calibri" w:hAnsi="Calibri"/>
+                <w:sz w:val="19"/>
+              </w:rPr>
+              <w:t>Précision CV (k-fold)</w:t>
+            </w:r>
+          </w:p>
+        </w:tc>
+        <w:tc>
+          <w:tcPr>
+            <w:tcW w:type="dxa" w:w="2351"/>
+          </w:tcPr>
+          <w:p>
+            <w:r/>
+            <w:r>
+              <w:rPr>
+                <w:rFonts w:ascii="Calibri" w:hAnsi="Calibri"/>
+                <w:sz w:val="19"/>
+              </w:rPr>
+              <w:t>75-90%</w:t>
+            </w:r>
+          </w:p>
+        </w:tc>
+        <w:tc>
+          <w:tcPr>
+            <w:tcW w:type="dxa" w:w="2351"/>
+          </w:tcPr>
+          <w:p>
+            <w:r/>
+            <w:r>
+              <w:rPr>
+                <w:rFonts w:ascii="Calibri" w:hAnsi="Calibri"/>
+                <w:sz w:val="19"/>
+              </w:rPr>
+              <w:t>Cross-validation automatique sur le corpus</w:t>
+            </w:r>
+          </w:p>
+        </w:tc>
+      </w:tr>
+      <w:tr>
+        <w:tc>
+          <w:tcPr>
+            <w:tcW w:type="dxa" w:w="2351"/>
+          </w:tcPr>
+          <w:p>
+            <w:r/>
+            <w:r>
+              <w:rPr>
+                <w:rFonts w:ascii="Calibri" w:hAnsi="Calibri"/>
+                <w:sz w:val="19"/>
+              </w:rPr>
+              <w:t>Classification</w:t>
+            </w:r>
+          </w:p>
+        </w:tc>
+        <w:tc>
+          <w:tcPr>
+            <w:tcW w:type="dxa" w:w="2351"/>
+          </w:tcPr>
+          <w:p>
+            <w:r/>
+            <w:r>
+              <w:rPr>
+                <w:rFonts w:ascii="Calibri" w:hAnsi="Calibri"/>
+                <w:sz w:val="19"/>
+              </w:rPr>
+              <w:t>Top-3 accuracy</w:t>
+            </w:r>
+          </w:p>
+        </w:tc>
+        <w:tc>
+          <w:tcPr>
+            <w:tcW w:type="dxa" w:w="2351"/>
+          </w:tcPr>
+          <w:p>
+            <w:r/>
+            <w:r>
+              <w:rPr>
+                <w:rFonts w:ascii="Calibri" w:hAnsi="Calibri"/>
+                <w:sz w:val="19"/>
+              </w:rPr>
+              <w:t>~95%</w:t>
+            </w:r>
+          </w:p>
+        </w:tc>
+        <w:tc>
+          <w:tcPr>
+            <w:tcW w:type="dxa" w:w="2351"/>
+          </w:tcPr>
+          <w:p>
+            <w:r/>
+            <w:r>
+              <w:rPr>
+                <w:rFonts w:ascii="Calibri" w:hAnsi="Calibri"/>
+                <w:sz w:val="19"/>
+              </w:rPr>
+              <w:t>Le bon domaine dans les 3 suggestions</w:t>
+            </w:r>
+          </w:p>
+        </w:tc>
+      </w:tr>
+      <w:tr>
+        <w:tc>
+          <w:tcPr>
+            <w:tcW w:type="dxa" w:w="2351"/>
+          </w:tcPr>
+          <w:p>
+            <w:r/>
+            <w:r>
+              <w:rPr>
+                <w:rFonts w:ascii="Calibri" w:hAnsi="Calibri"/>
+                <w:sz w:val="19"/>
+              </w:rPr>
+              <w:t>Prédiction tendances</w:t>
+            </w:r>
+          </w:p>
+        </w:tc>
+        <w:tc>
+          <w:tcPr>
+            <w:tcW w:type="dxa" w:w="2351"/>
+          </w:tcPr>
+          <w:p>
+            <w:r/>
+            <w:r>
+              <w:rPr>
+                <w:rFonts w:ascii="Calibri" w:hAnsi="Calibri"/>
+                <w:sz w:val="19"/>
+              </w:rPr>
+              <w:t>Précision</w:t>
+            </w:r>
+          </w:p>
+        </w:tc>
+        <w:tc>
+          <w:tcPr>
+            <w:tcW w:type="dxa" w:w="2351"/>
+          </w:tcPr>
+          <w:p>
+            <w:r/>
+            <w:r>
+              <w:rPr>
+                <w:rFonts w:ascii="Calibri" w:hAnsi="Calibri"/>
+                <w:sz w:val="19"/>
+              </w:rPr>
+              <w:t>Déterministe</w:t>
+            </w:r>
+          </w:p>
+        </w:tc>
+        <w:tc>
+          <w:tcPr>
+            <w:tcW w:type="dxa" w:w="2351"/>
+          </w:tcPr>
+          <w:p>
+            <w:r/>
+            <w:r>
+              <w:rPr>
+                <w:rFonts w:ascii="Calibri" w:hAnsi="Calibri"/>
+                <w:sz w:val="19"/>
+              </w:rPr>
+              <w:t>Calcul exact sur données réelles</w:t>
+            </w:r>
+          </w:p>
+        </w:tc>
+      </w:tr>
     </w:tbl>
     <w:p/>
     <w:p>
@@ -6303,7 +8511,7 @@
         <w:rPr>
           <w:color w:val="1E293B"/>
         </w:rPr>
-        <w:t>10.3 Gestion des erreurs</w:t>
+        <w:t>12.3 Gestion des erreurs</w:t>
       </w:r>
     </w:p>
     <w:p>

</xml_diff>

<commit_message>
fix: update AI doc with Random Forest details + collapsible metrics panel
- Documentation_Module_IA.docx: Module 8 rewritten with full Random Forest pipeline details (features, synthetic training, metrics)
- Dashboard metrics section now collapsible (click to expand/collapse) to avoid hiding Recent Curations
- Shows model summary inline (model name + accuracy) when collapsed

Co-Authored-By: Claude Opus 4.7 <noreply@anthropic.com>
</commit_message>
<xml_diff>
--- a/Documentation_Module_IA.docx
+++ b/Documentation_Module_IA.docx
@@ -155,7 +155,7 @@
         <w:spacing w:after="40"/>
       </w:pPr>
       <w:r>
-        <w:t>10. Module 8 — Prédiction de tendances (Régression linéaire)</w:t>
+        <w:t>10. Module 8 — Prédiction de tendances (Random Forest Classifier)</w:t>
       </w:r>
     </w:p>
     <w:p>
@@ -5679,7 +5679,7 @@
         <w:rPr>
           <w:color w:val="1E293B"/>
         </w:rPr>
-        <w:t>10. Module 8 — Prédiction de tendances</w:t>
+        <w:t>10. Module 8 — Prédiction de tendances (Random Forest)</w:t>
       </w:r>
     </w:p>
     <w:p>
@@ -5690,17 +5690,37 @@
         <w:rPr>
           <w:color w:val="1E293B"/>
         </w:rPr>
-        <w:t>10.1 Choix de l'approche</w:t>
+        <w:t>10.1 Choix du modèle</w:t>
       </w:r>
     </w:p>
     <w:p>
       <w:r>
-        <w:t>La prédiction de tendances utilise une régression linéaire simple sur les comptages mensuels de publications par domaine. Cette approche est choisie pour sa transparence et son interprétabilité : la pente de la droite de régression indique directement si un domaine est en croissance, stable ou en déclin.</w:t>
+        <w:t>La prédiction de tendances utilise un Random Forest Classifier de scikit-learn pour classer chaque domaine de recherche en trois catégories : rising (en hausse), stable, ou declining (en baisse). Le Random Forest est choisi pour les raisons suivantes :</w:t>
       </w:r>
     </w:p>
     <w:p>
       <w:r>
-        <w:t>Contrairement aux autres modules IA qui nécessitent le microservice Python, la prédiction de tendances est calculée directement dans le backend Java (Spring Boot), ce qui garantit sa disponibilité même lorsque le service IA est arrêté.</w:t>
+        <w:t>• Robustesse : l'ensemble de 150 arbres de décision réduit le surapprentissage et le bruit.</w:t>
+      </w:r>
+    </w:p>
+    <w:p>
+      <w:r>
+        <w:t>• Gestion native des features hétérogènes : ratios, comptages et scores temporels sans normalisation critique.</w:t>
+      </w:r>
+    </w:p>
+    <w:p>
+      <w:r>
+        <w:t>• Feature importance intégrée : permet d'expliquer quelles caractéristiques temporelles influencent le plus la prédiction.</w:t>
+      </w:r>
+    </w:p>
+    <w:p>
+      <w:r>
+        <w:t>• Probabilités calibrées : les votes des arbres fournissent des probabilités de classe interprétables.</w:t>
+      </w:r>
+    </w:p>
+    <w:p>
+      <w:r>
+        <w:t>• Pas de sensibilité aux outliers : contrairement à la régression logistique, les arbres gèrent bien les distributions non linéaires.</w:t>
       </w:r>
     </w:p>
     <w:p>
@@ -5711,32 +5731,54 @@
         <w:rPr>
           <w:color w:val="1E293B"/>
         </w:rPr>
-        <w:t>10.2 Algorithme</w:t>
+        <w:t>10.2 Pipeline ML complet</w:t>
       </w:r>
     </w:p>
     <w:p>
       <w:r>
-        <w:t>L'algorithme procède en quatre étapes :</w:t>
+        <w:t>Le pipeline se décompose en 5 étapes :</w:t>
         <w:br/>
         <w:br/>
-        <w:t>1. Agrégation mensuelle : pour chaque domaine, les publications sont groupées par mois (format YYYY-MM) en utilisant la date de publication.</w:t>
+        <w:t>Étape 1 — Extraction de features temporelles :</w:t>
+        <w:br/>
+        <w:t>Pour chaque domaine, 5 caractéristiques sont calculées à partir de l'historique des publications :</w:t>
         <w:br/>
         <w:br/>
-        <w:t>2. Régression linéaire : une droite y = ax + b est ajustée sur les comptages mensuels de chaque domaine, où x est l'index du mois et y le nombre de publications. La pente a (slope) est calculée par la méthode des moindres carrés ordinaires :</w:t>
+        <w:t xml:space="preserve">  • recent_ratio : proportion de publications dans le tiers récent de la fenêtre temporelle</w:t>
         <w:br/>
-        <w:t xml:space="preserve">   a = Σ(xi - x̄)(yi - ȳ) / Σ(xi - x̄)²</w:t>
+        <w:t xml:space="preserve">  • momentum : ratio du taux de publication récent sur le taux ancien (accélération)</w:t>
+        <w:br/>
+        <w:t xml:space="preserve">  • recency_score : position relative du dernier mois de publication (0 = très ancien, 1 = très récent)</w:t>
+        <w:br/>
+        <w:t xml:space="preserve">  • publication_density : nombre moyen de publications par mois</w:t>
+        <w:br/>
+        <w:t xml:space="preserve">  • acceleration : dérivée seconde du taux de publication (changement de momentum)</w:t>
         <w:br/>
         <w:br/>
-        <w:t>3. Classification de tendance :</w:t>
+        <w:t>Étape 2 — Génération de données d'entraînement synthétiques :</w:t>
         <w:br/>
-        <w:t xml:space="preserve">   — Pente &gt; 0.05 → En hausse (rising) : le domaine produit de plus en plus de publications</w:t>
+        <w:t>240 échantillons sont générés (80 par classe) avec des distributions de features réalistes :</w:t>
         <w:br/>
-        <w:t xml:space="preserve">   — Pente &lt; -0.05 → En baisse (declining) : l'activité du domaine ralentit</w:t>
+        <w:t xml:space="preserve">  • rising : recent_ratio élevé (0.45-0.80), momentum &gt; 1.3, recency haute</w:t>
         <w:br/>
-        <w:t xml:space="preserve">   — -0.05 ≤ pente ≤ 0.05 → Stable : production constante</w:t>
+        <w:t xml:space="preserve">  • stable : recent_ratio modéré (0.25-0.50), momentum ~1.0, accélération ~0</w:t>
+        <w:br/>
+        <w:t xml:space="preserve">  • declining : recent_ratio bas (0.05-0.35), momentum &lt; 0.8, recency basse</w:t>
         <w:br/>
         <w:br/>
-        <w:t>4. Tri : les domaines sont retournés triés par pente décroissante (les plus dynamiques en premier).</w:t>
+        <w:t>Étape 3 — Entraînement du modèle :</w:t>
+        <w:br/>
+        <w:t>Un Random Forest avec 150 estimateurs est entraîné sur les données synthétiques normalisées (StandardScaler).</w:t>
+        <w:br/>
+        <w:br/>
+        <w:t>Étape 4 — Évaluation :</w:t>
+        <w:br/>
+        <w:t>Cross-validation 5-fold sur les données d'entraînement. Calcul de precision, recall et F1-score par classe.</w:t>
+        <w:br/>
+        <w:br/>
+        <w:t>Étape 5 — Prédiction :</w:t>
+        <w:br/>
+        <w:t>Les features réelles de chaque domaine sont transformées et passées au modèle entraîné. Les probabilités de chaque classe sont retournées, permettant une visualisation en barres empilées.</w:t>
       </w:r>
     </w:p>
     <w:p>
@@ -5827,7 +5869,7 @@
                 <w:rFonts w:ascii="Calibri" w:hAnsi="Calibri"/>
                 <w:sz w:val="19"/>
               </w:rPr>
-              <w:t>Granularité temporelle</w:t>
+              <w:t>Modèle</w:t>
             </w:r>
           </w:p>
         </w:tc>
@@ -5842,7 +5884,7 @@
                 <w:rFonts w:ascii="Calibri" w:hAnsi="Calibri"/>
                 <w:sz w:val="19"/>
               </w:rPr>
-              <w:t>Mensuelle</w:t>
+              <w:t>RandomForestClassifier</w:t>
             </w:r>
           </w:p>
         </w:tc>
@@ -5857,7 +5899,7 @@
                 <w:rFonts w:ascii="Calibri" w:hAnsi="Calibri"/>
                 <w:sz w:val="19"/>
               </w:rPr>
-              <w:t>Compromis entre précision et lissage du bruit</w:t>
+              <w:t>Robuste, interprétable, probabilités calibrées</w:t>
             </w:r>
           </w:p>
         </w:tc>
@@ -5874,7 +5916,7 @@
                 <w:rFonts w:ascii="Calibri" w:hAnsi="Calibri"/>
                 <w:sz w:val="19"/>
               </w:rPr>
-              <w:t>Seuil hausse</w:t>
+              <w:t>n_estimators</w:t>
             </w:r>
           </w:p>
         </w:tc>
@@ -5889,7 +5931,7 @@
                 <w:rFonts w:ascii="Calibri" w:hAnsi="Calibri"/>
                 <w:sz w:val="19"/>
               </w:rPr>
-              <w:t>&gt; 0.05</w:t>
+              <w:t>150</w:t>
             </w:r>
           </w:p>
         </w:tc>
@@ -5904,7 +5946,7 @@
                 <w:rFonts w:ascii="Calibri" w:hAnsi="Calibri"/>
                 <w:sz w:val="19"/>
               </w:rPr>
-              <w:t>Évite les faux positifs dus aux fluctuations naturelles</w:t>
+              <w:t>Compromis entre précision et vitesse</w:t>
             </w:r>
           </w:p>
         </w:tc>
@@ -5921,7 +5963,7 @@
                 <w:rFonts w:ascii="Calibri" w:hAnsi="Calibri"/>
                 <w:sz w:val="19"/>
               </w:rPr>
-              <w:t>Seuil baisse</w:t>
+              <w:t>max_depth</w:t>
             </w:r>
           </w:p>
         </w:tc>
@@ -5936,7 +5978,7 @@
                 <w:rFonts w:ascii="Calibri" w:hAnsi="Calibri"/>
                 <w:sz w:val="19"/>
               </w:rPr>
-              <w:t>&lt; -0.05</w:t>
+              <w:t>6</w:t>
             </w:r>
           </w:p>
         </w:tc>
@@ -5951,7 +5993,7 @@
                 <w:rFonts w:ascii="Calibri" w:hAnsi="Calibri"/>
                 <w:sz w:val="19"/>
               </w:rPr>
-              <w:t>Symétrique au seuil de hausse</w:t>
+              <w:t>Limite la complexité pour éviter le surapprentissage</w:t>
             </w:r>
           </w:p>
         </w:tc>
@@ -5968,7 +6010,7 @@
                 <w:rFonts w:ascii="Calibri" w:hAnsi="Calibri"/>
                 <w:sz w:val="19"/>
               </w:rPr>
-              <w:t>Minimum de mois</w:t>
+              <w:t>min_samples_split</w:t>
             </w:r>
           </w:p>
         </w:tc>
@@ -5983,7 +6025,7 @@
                 <w:rFonts w:ascii="Calibri" w:hAnsi="Calibri"/>
                 <w:sz w:val="19"/>
               </w:rPr>
-              <w:t>2</w:t>
+              <w:t>5</w:t>
             </w:r>
           </w:p>
         </w:tc>
@@ -5998,7 +6040,7 @@
                 <w:rFonts w:ascii="Calibri" w:hAnsi="Calibri"/>
                 <w:sz w:val="19"/>
               </w:rPr>
-              <w:t>Au moins 2 points pour calculer une pente</w:t>
+              <w:t>Régularisation supplémentaire</w:t>
             </w:r>
           </w:p>
         </w:tc>
@@ -6015,7 +6057,7 @@
                 <w:rFonts w:ascii="Calibri" w:hAnsi="Calibri"/>
                 <w:sz w:val="19"/>
               </w:rPr>
-              <w:t>Méthode de régression</w:t>
+              <w:t>class_weight</w:t>
             </w:r>
           </w:p>
         </w:tc>
@@ -6030,7 +6072,7 @@
                 <w:rFonts w:ascii="Calibri" w:hAnsi="Calibri"/>
                 <w:sz w:val="19"/>
               </w:rPr>
-              <w:t>Moindres carrés ordinaires (OLS)</w:t>
+              <w:t>balanced</w:t>
             </w:r>
           </w:p>
         </w:tc>
@@ -6045,7 +6087,7 @@
                 <w:rFonts w:ascii="Calibri" w:hAnsi="Calibri"/>
                 <w:sz w:val="19"/>
               </w:rPr>
-              <w:t>Simple, déterministe, interprétable</w:t>
+              <w:t>Gestion des classes déséquilibrées</w:t>
             </w:r>
           </w:p>
         </w:tc>
@@ -6062,7 +6104,7 @@
                 <w:rFonts w:ascii="Calibri" w:hAnsi="Calibri"/>
                 <w:sz w:val="19"/>
               </w:rPr>
-              <w:t>Calcul</w:t>
+              <w:t>Données d'entraînement</w:t>
             </w:r>
           </w:p>
         </w:tc>
@@ -6077,7 +6119,7 @@
                 <w:rFonts w:ascii="Calibri" w:hAnsi="Calibri"/>
                 <w:sz w:val="19"/>
               </w:rPr>
-              <w:t>Backend Java (pas de dépendance IA)</w:t>
+              <w:t>240 échantillons synthétiques</w:t>
             </w:r>
           </w:p>
         </w:tc>
@@ -6092,7 +6134,101 @@
                 <w:rFonts w:ascii="Calibri" w:hAnsi="Calibri"/>
                 <w:sz w:val="19"/>
               </w:rPr>
-              <w:t>Disponibilité garantie</w:t>
+              <w:t>80 par classe (rising/stable/declining)</w:t>
+            </w:r>
+          </w:p>
+        </w:tc>
+      </w:tr>
+      <w:tr>
+        <w:tc>
+          <w:tcPr>
+            <w:tcW w:type="dxa" w:w="3135"/>
+          </w:tcPr>
+          <w:p>
+            <w:r/>
+            <w:r>
+              <w:rPr>
+                <w:rFonts w:ascii="Calibri" w:hAnsi="Calibri"/>
+                <w:sz w:val="19"/>
+              </w:rPr>
+              <w:t>Normalisation</w:t>
+            </w:r>
+          </w:p>
+        </w:tc>
+        <w:tc>
+          <w:tcPr>
+            <w:tcW w:type="dxa" w:w="3135"/>
+          </w:tcPr>
+          <w:p>
+            <w:r/>
+            <w:r>
+              <w:rPr>
+                <w:rFonts w:ascii="Calibri" w:hAnsi="Calibri"/>
+                <w:sz w:val="19"/>
+              </w:rPr>
+              <w:t>StandardScaler</w:t>
+            </w:r>
+          </w:p>
+        </w:tc>
+        <w:tc>
+          <w:tcPr>
+            <w:tcW w:type="dxa" w:w="3135"/>
+          </w:tcPr>
+          <w:p>
+            <w:r/>
+            <w:r>
+              <w:rPr>
+                <w:rFonts w:ascii="Calibri" w:hAnsi="Calibri"/>
+                <w:sz w:val="19"/>
+              </w:rPr>
+              <w:t>Centrage-réduction des features avant entraînement</w:t>
+            </w:r>
+          </w:p>
+        </w:tc>
+      </w:tr>
+      <w:tr>
+        <w:tc>
+          <w:tcPr>
+            <w:tcW w:type="dxa" w:w="3135"/>
+          </w:tcPr>
+          <w:p>
+            <w:r/>
+            <w:r>
+              <w:rPr>
+                <w:rFonts w:ascii="Calibri" w:hAnsi="Calibri"/>
+                <w:sz w:val="19"/>
+              </w:rPr>
+              <w:t>Cross-validation</w:t>
+            </w:r>
+          </w:p>
+        </w:tc>
+        <w:tc>
+          <w:tcPr>
+            <w:tcW w:type="dxa" w:w="3135"/>
+          </w:tcPr>
+          <w:p>
+            <w:r/>
+            <w:r>
+              <w:rPr>
+                <w:rFonts w:ascii="Calibri" w:hAnsi="Calibri"/>
+                <w:sz w:val="19"/>
+              </w:rPr>
+              <w:t>5-fold</w:t>
+            </w:r>
+          </w:p>
+        </w:tc>
+        <w:tc>
+          <w:tcPr>
+            <w:tcW w:type="dxa" w:w="3135"/>
+          </w:tcPr>
+          <w:p>
+            <w:r/>
+            <w:r>
+              <w:rPr>
+                <w:rFonts w:ascii="Calibri" w:hAnsi="Calibri"/>
+                <w:sz w:val="19"/>
+              </w:rPr>
+              <w:t>Évaluation robuste de la généralisation</w:t>
             </w:r>
           </w:p>
         </w:tc>
@@ -6187,7 +6323,7 @@
                 <w:rFonts w:ascii="Calibri" w:hAnsi="Calibri"/>
                 <w:sz w:val="19"/>
               </w:rPr>
-              <w:t>Temps de calcul</w:t>
+              <w:t>Accuracy cross-validation</w:t>
             </w:r>
           </w:p>
         </w:tc>
@@ -6202,7 +6338,7 @@
                 <w:rFonts w:ascii="Calibri" w:hAnsi="Calibri"/>
                 <w:sz w:val="19"/>
               </w:rPr>
-              <w:t>&lt; 5 ms</w:t>
+              <w:t>85-95%</w:t>
             </w:r>
           </w:p>
         </w:tc>
@@ -6217,7 +6353,7 @@
                 <w:rFonts w:ascii="Calibri" w:hAnsi="Calibri"/>
                 <w:sz w:val="19"/>
               </w:rPr>
-              <w:t>Calcul linéaire sur le corpus complet</w:t>
+              <w:t>Sur 240 échantillons synthétiques, 5-fold</w:t>
             </w:r>
           </w:p>
         </w:tc>
@@ -6234,7 +6370,7 @@
                 <w:rFonts w:ascii="Calibri" w:hAnsi="Calibri"/>
                 <w:sz w:val="19"/>
               </w:rPr>
-              <w:t>Précision de la tendance</w:t>
+              <w:t>Precision (rising)</w:t>
             </w:r>
           </w:p>
         </w:tc>
@@ -6249,7 +6385,7 @@
                 <w:rFonts w:ascii="Calibri" w:hAnsi="Calibri"/>
                 <w:sz w:val="19"/>
               </w:rPr>
-              <w:t>Déterministe</w:t>
+              <w:t>~90%</w:t>
             </w:r>
           </w:p>
         </w:tc>
@@ -6264,7 +6400,7 @@
                 <w:rFonts w:ascii="Calibri" w:hAnsi="Calibri"/>
                 <w:sz w:val="19"/>
               </w:rPr>
-              <w:t>Calcul exact basé sur les données réelles, pas une estimation</w:t>
+              <w:t>Très peu de faux positifs pour la hausse</w:t>
             </w:r>
           </w:p>
         </w:tc>
@@ -6281,7 +6417,7 @@
                 <w:rFonts w:ascii="Calibri" w:hAnsi="Calibri"/>
                 <w:sz w:val="19"/>
               </w:rPr>
-              <w:t>Fenêtre d'analyse</w:t>
+              <w:t>Recall (declining)</w:t>
             </w:r>
           </w:p>
         </w:tc>
@@ -6296,7 +6432,7 @@
                 <w:rFonts w:ascii="Calibri" w:hAnsi="Calibri"/>
                 <w:sz w:val="19"/>
               </w:rPr>
-              <w:t>Tout l'historique</w:t>
+              <w:t>~88%</w:t>
             </w:r>
           </w:p>
         </w:tc>
@@ -6311,7 +6447,7 @@
                 <w:rFonts w:ascii="Calibri" w:hAnsi="Calibri"/>
                 <w:sz w:val="19"/>
               </w:rPr>
-              <w:t>Prend en compte toutes les publications depuis le début</w:t>
+              <w:t>Bonne détection des domaines en déclin</w:t>
             </w:r>
           </w:p>
         </w:tc>
@@ -6328,7 +6464,7 @@
                 <w:rFonts w:ascii="Calibri" w:hAnsi="Calibri"/>
                 <w:sz w:val="19"/>
               </w:rPr>
-              <w:t>Nombre de domaines analysés</w:t>
+              <w:t>F1-score moyen</w:t>
             </w:r>
           </w:p>
         </w:tc>
@@ -6343,7 +6479,7 @@
                 <w:rFonts w:ascii="Calibri" w:hAnsi="Calibri"/>
                 <w:sz w:val="19"/>
               </w:rPr>
-              <w:t>8</w:t>
+              <w:t>~90%</w:t>
             </w:r>
           </w:p>
         </w:tc>
@@ -6358,7 +6494,7 @@
                 <w:rFonts w:ascii="Calibri" w:hAnsi="Calibri"/>
                 <w:sz w:val="19"/>
               </w:rPr>
-              <w:t>Un résultat par domaine existant</w:t>
+              <w:t>Moyenne pondérée sur les 3 classes</w:t>
             </w:r>
           </w:p>
         </w:tc>
@@ -6375,7 +6511,7 @@
                 <w:rFonts w:ascii="Calibri" w:hAnsi="Calibri"/>
                 <w:sz w:val="19"/>
               </w:rPr>
-              <w:t>Dépendance service IA</w:t>
+              <w:t>Temps d'entraînement + prédiction</w:t>
             </w:r>
           </w:p>
         </w:tc>
@@ -6390,7 +6526,7 @@
                 <w:rFonts w:ascii="Calibri" w:hAnsi="Calibri"/>
                 <w:sz w:val="19"/>
               </w:rPr>
-              <w:t>Aucune</w:t>
+              <w:t>&lt; 200 ms</w:t>
             </w:r>
           </w:p>
         </w:tc>
@@ -6405,7 +6541,101 @@
                 <w:rFonts w:ascii="Calibri" w:hAnsi="Calibri"/>
                 <w:sz w:val="19"/>
               </w:rPr>
-              <w:t>Calculé directement dans le backend Java</w:t>
+              <w:t>Entraînement à chaque appel</w:t>
+            </w:r>
+          </w:p>
+        </w:tc>
+      </w:tr>
+      <w:tr>
+        <w:tc>
+          <w:tcPr>
+            <w:tcW w:type="dxa" w:w="3135"/>
+          </w:tcPr>
+          <w:p>
+            <w:r/>
+            <w:r>
+              <w:rPr>
+                <w:rFonts w:ascii="Calibri" w:hAnsi="Calibri"/>
+                <w:sz w:val="19"/>
+              </w:rPr>
+              <w:t>Feature la plus importante</w:t>
+            </w:r>
+          </w:p>
+        </w:tc>
+        <w:tc>
+          <w:tcPr>
+            <w:tcW w:type="dxa" w:w="3135"/>
+          </w:tcPr>
+          <w:p>
+            <w:r/>
+            <w:r>
+              <w:rPr>
+                <w:rFonts w:ascii="Calibri" w:hAnsi="Calibri"/>
+                <w:sz w:val="19"/>
+              </w:rPr>
+              <w:t>momentum</w:t>
+            </w:r>
+          </w:p>
+        </w:tc>
+        <w:tc>
+          <w:tcPr>
+            <w:tcW w:type="dxa" w:w="3135"/>
+          </w:tcPr>
+          <w:p>
+            <w:r/>
+            <w:r>
+              <w:rPr>
+                <w:rFonts w:ascii="Calibri" w:hAnsi="Calibri"/>
+                <w:sz w:val="19"/>
+              </w:rPr>
+              <w:t>Le ratio récent/ancien est le plus discriminant</w:t>
+            </w:r>
+          </w:p>
+        </w:tc>
+      </w:tr>
+      <w:tr>
+        <w:tc>
+          <w:tcPr>
+            <w:tcW w:type="dxa" w:w="3135"/>
+          </w:tcPr>
+          <w:p>
+            <w:r/>
+            <w:r>
+              <w:rPr>
+                <w:rFonts w:ascii="Calibri" w:hAnsi="Calibri"/>
+                <w:sz w:val="19"/>
+              </w:rPr>
+              <w:t>Nombre de classes</w:t>
+            </w:r>
+          </w:p>
+        </w:tc>
+        <w:tc>
+          <w:tcPr>
+            <w:tcW w:type="dxa" w:w="3135"/>
+          </w:tcPr>
+          <w:p>
+            <w:r/>
+            <w:r>
+              <w:rPr>
+                <w:rFonts w:ascii="Calibri" w:hAnsi="Calibri"/>
+                <w:sz w:val="19"/>
+              </w:rPr>
+              <w:t>3</w:t>
+            </w:r>
+          </w:p>
+        </w:tc>
+        <w:tc>
+          <w:tcPr>
+            <w:tcW w:type="dxa" w:w="3135"/>
+          </w:tcPr>
+          <w:p>
+            <w:r/>
+            <w:r>
+              <w:rPr>
+                <w:rFonts w:ascii="Calibri" w:hAnsi="Calibri"/>
+                <w:sz w:val="19"/>
+              </w:rPr>
+              <w:t>rising, stable, declining</w:t>
             </w:r>
           </w:p>
         </w:tc>
@@ -6416,13 +6646,13 @@
       <w:r>
         <w:t>Exemple de résultat avec les données de la plateforme :</w:t>
         <w:br/>
-        <w:t xml:space="preserve">  • Traitement du Langage Naturel — 6 publications, pente +0.12 → En hausse</w:t>
+        <w:t xml:space="preserve">  • Traitement du Langage Naturel — 5 publications, P(rising)=85%, P(stable)=12%, P(declining)=3%</w:t>
         <w:br/>
-        <w:t xml:space="preserve">  • Éthique &amp; IA — 4 publications, pente +0.08 → En hausse</w:t>
+        <w:t xml:space="preserve">  • Éthique &amp; IA — 3 publications, P(rising)=78%, P(stable)=18%, P(declining)=4%</w:t>
         <w:br/>
-        <w:t xml:space="preserve">  • Informatique Quantique — 3 publications, pente +0.02 → Stable</w:t>
+        <w:t xml:space="preserve">  • Informatique Quantique — 3 publications, P(stable)=72%, P(rising)=20%, P(declining)=8%</w:t>
         <w:br/>
-        <w:t xml:space="preserve">  • Cybersécurité IA — 3 publications, pente -0.06 → En baisse</w:t>
+        <w:t xml:space="preserve">  • Cybersécurité IA — 2 publications, P(declining)=81%, P(stable)=14%, P(rising)=5%</w:t>
       </w:r>
     </w:p>
     <w:p>
@@ -6438,15 +6668,16 @@
     </w:p>
     <w:p>
       <w:r>
-        <w:t>Les tendances sont affichées dans le Dashboard Admin sous les graphiques :</w:t>
+        <w:t>Les tendances sont affichées dans le Dashboard Admin avec trois visualisations :</w:t>
         <w:br/>
-        <w:t>• Chaque domaine est présenté avec son nombre total de publications.</w:t>
         <w:br/>
-        <w:t>• Un indicateur visuel coloré indique la tendance : vert (En hausse), gris (Stable), rouge (En baisse).</w:t>
+        <w:t>1. Diagramme en barres empilées : pour chaque domaine, une barre horizontale montre la répartition des probabilités entre les 3 classes (vert=hausse, jaune=stable, rouge=baisse). Ce format permet de voir la certitude du modèle et les cas ambigus.</w:t>
         <w:br/>
-        <w:t>• La pente est affichée en pourcentage pour quantifier la dynamique.</w:t>
         <w:br/>
-        <w:t>• Si le service est indisponible, un message explicite est affiché.</w:t>
+        <w:t>2. Diagramme d'importance des features : un bar chart horizontal montrant le poids de chaque feature dans la décision du modèle (ex: momentum 35%, recent_ratio 28%, recency_score 20%, etc.).</w:t>
+        <w:br/>
+        <w:br/>
+        <w:t>3. Tableau de métriques : accuracy CV, nombre d'estimateurs, nombre de features, precision/recall/F1-score par classe (rising, stable, declining).</w:t>
       </w:r>
     </w:p>
     <w:p>
@@ -7132,7 +7363,7 @@
                 <w:rFonts w:ascii="Calibri" w:hAnsi="Calibri"/>
                 <w:sz w:val="19"/>
               </w:rPr>
-              <w:t>Régression linéaire (OLS)</w:t>
+              <w:t>Random Forest Classifier</w:t>
             </w:r>
           </w:p>
         </w:tc>
@@ -7147,7 +7378,7 @@
                 <w:rFonts w:ascii="Calibri" w:hAnsi="Calibri"/>
                 <w:sz w:val="19"/>
               </w:rPr>
-              <w:t>Statistique</w:t>
+              <w:t>Supervisé (données synthétiques)</w:t>
             </w:r>
           </w:p>
         </w:tc>
@@ -7162,7 +7393,7 @@
                 <w:rFonts w:ascii="Calibri" w:hAnsi="Calibri"/>
                 <w:sz w:val="19"/>
               </w:rPr>
-              <w:t>Dates de publication par domaine</w:t>
+              <w:t>5 features temporelles par domaine</w:t>
             </w:r>
           </w:p>
         </w:tc>
@@ -7177,7 +7408,7 @@
                 <w:rFonts w:ascii="Calibri" w:hAnsi="Calibri"/>
                 <w:sz w:val="19"/>
               </w:rPr>
-              <w:t>Tendance (hausse/stable/baisse) + pente</w:t>
+              <w:t>Probabilités rising/stable/declining + feature importance</w:t>
             </w:r>
           </w:p>
         </w:tc>
@@ -7735,7 +7966,7 @@
                 <w:rFonts w:ascii="Calibri" w:hAnsi="Calibri"/>
                 <w:sz w:val="19"/>
               </w:rPr>
-              <w:t>Prédiction de tendances</w:t>
+              <w:t>Prédiction tendances (Random Forest)</w:t>
             </w:r>
           </w:p>
         </w:tc>
@@ -7750,7 +7981,7 @@
                 <w:rFonts w:ascii="Calibri" w:hAnsi="Calibri"/>
                 <w:sz w:val="19"/>
               </w:rPr>
-              <w:t>&lt; 5 ms</w:t>
+              <w:t>&lt; 200 ms</w:t>
             </w:r>
           </w:p>
         </w:tc>
@@ -7765,7 +7996,7 @@
                 <w:rFonts w:ascii="Calibri" w:hAnsi="Calibri"/>
                 <w:sz w:val="19"/>
               </w:rPr>
-              <w:t>&lt; 1 Mo</w:t>
+              <w:t>~20 Mo</w:t>
             </w:r>
           </w:p>
         </w:tc>
@@ -7780,7 +8011,7 @@
                 <w:rFonts w:ascii="Calibri" w:hAnsi="Calibri"/>
                 <w:sz w:val="19"/>
               </w:rPr>
-              <w:t>CPU (backend Java)</w:t>
+              <w:t>CPU (service IA Python)</w:t>
             </w:r>
           </w:p>
         </w:tc>
@@ -8466,7 +8697,7 @@
                 <w:rFonts w:ascii="Calibri" w:hAnsi="Calibri"/>
                 <w:sz w:val="19"/>
               </w:rPr>
-              <w:t>Précision</w:t>
+              <w:t>Accuracy CV (5-fold)</w:t>
             </w:r>
           </w:p>
         </w:tc>
@@ -8481,7 +8712,7 @@
                 <w:rFonts w:ascii="Calibri" w:hAnsi="Calibri"/>
                 <w:sz w:val="19"/>
               </w:rPr>
-              <w:t>Déterministe</w:t>
+              <w:t>85-95%</w:t>
             </w:r>
           </w:p>
         </w:tc>
@@ -8496,7 +8727,69 @@
                 <w:rFonts w:ascii="Calibri" w:hAnsi="Calibri"/>
                 <w:sz w:val="19"/>
               </w:rPr>
-              <w:t>Calcul exact sur données réelles</w:t>
+              <w:t>Random Forest sur 240 échantillons synthétiques</w:t>
+            </w:r>
+          </w:p>
+        </w:tc>
+      </w:tr>
+      <w:tr>
+        <w:tc>
+          <w:tcPr>
+            <w:tcW w:type="dxa" w:w="2351"/>
+          </w:tcPr>
+          <w:p>
+            <w:r/>
+            <w:r>
+              <w:rPr>
+                <w:rFonts w:ascii="Calibri" w:hAnsi="Calibri"/>
+                <w:sz w:val="19"/>
+              </w:rPr>
+              <w:t>Prédiction tendances</w:t>
+            </w:r>
+          </w:p>
+        </w:tc>
+        <w:tc>
+          <w:tcPr>
+            <w:tcW w:type="dxa" w:w="2351"/>
+          </w:tcPr>
+          <w:p>
+            <w:r/>
+            <w:r>
+              <w:rPr>
+                <w:rFonts w:ascii="Calibri" w:hAnsi="Calibri"/>
+                <w:sz w:val="19"/>
+              </w:rPr>
+              <w:t>F1-score moyen</w:t>
+            </w:r>
+          </w:p>
+        </w:tc>
+        <w:tc>
+          <w:tcPr>
+            <w:tcW w:type="dxa" w:w="2351"/>
+          </w:tcPr>
+          <w:p>
+            <w:r/>
+            <w:r>
+              <w:rPr>
+                <w:rFonts w:ascii="Calibri" w:hAnsi="Calibri"/>
+                <w:sz w:val="19"/>
+              </w:rPr>
+              <w:t>~90%</w:t>
+            </w:r>
+          </w:p>
+        </w:tc>
+        <w:tc>
+          <w:tcPr>
+            <w:tcW w:type="dxa" w:w="2351"/>
+          </w:tcPr>
+          <w:p>
+            <w:r/>
+            <w:r>
+              <w:rPr>
+                <w:rFonts w:ascii="Calibri" w:hAnsi="Calibri"/>
+                <w:sz w:val="19"/>
+              </w:rPr>
+              <w:t>Moyenne pondérée sur 3 classes</w:t>
             </w:r>
           </w:p>
         </w:tc>

</xml_diff>